<commit_message>
Rework templates: true RTL, visible fill-in lines, per-section guidance
Address review feedback on the Word output:
- Force true RTL via scripts/rtl_postprocess.py — bidi + right alignment on
  every paragraph and bidiVisual on every table (column order now starts from
  the right), applied after pandoc.
- Replace abstract [TO FILL] markers with visible underscore fill-in lines and
  blank writing space (via «FILL» / «SPACER» tokens expanded at render time).
- Add a detailed bilingual "what to fill in" explanation to every section, not
  just headings, so non-technical position-holders know exactly what to write.
Regenerate all six dist/word/*.docx.

https://claude.ai/code/session_01AVeYWVQcnguBEpZNQZ1Nyc
</commit_message>
<xml_diff>
--- a/dist/word/job-description.docx
+++ b/dist/word/job-description.docx
@@ -6,490 +6,903 @@
     <w:p>
       <w:pPr>
         <w:pStyle w:val="Heading1"/>
-      </w:pPr>
-      <w:r>
+        <w:bidi/>
+        <w:jc w:val="right"/>
+      </w:pPr>
+      <w:r>
+        <w:rPr>
+          <w:rtl/>
+        </w:rPr>
         <w:t xml:space="preserve">הגדרת תפקיד · Job / Role Definition</w:t>
+      </w:r>
+    </w:p>
+    <w:p>
+      <w:pPr>
+        <w:pStyle w:val="FirstParagraph"/>
+        <w:bidi/>
+        <w:jc w:val="right"/>
+      </w:pPr>
+      <w:r>
+        <w:rPr>
+          <w:iCs/>
+          <w:i/>
+          <w:rtl/>
+        </w:rPr>
+        <w:t xml:space="preserve">הסבר כללי:</w:t>
+      </w:r>
+      <w:r>
+        <w:rPr>
+          <w:rtl/>
+        </w:rPr>
+        <w:t xml:space="preserve"> </w:t>
+      </w:r>
+      <w:r>
+        <w:rPr>
+          <w:rtl/>
+        </w:rPr>
+        <w:t xml:space="preserve">מסמך זה מגדיר תפקיד בודד בחברה. מלאו את השדות בקו תחתון. החלקים 1–2 הם</w:t>
+      </w:r>
+      <w:r>
+        <w:rPr>
+          <w:rtl/>
+        </w:rPr>
+        <w:t xml:space="preserve"> </w:t>
+      </w:r>
+      <w:r>
+        <w:rPr>
+          <w:rtl/>
+        </w:rPr>
+        <w:t xml:space="preserve">ליבת המסמך (לכל תפקיד), והחלקים 3–6 הם הרחבות אופציונליות — השאירו את מה שרלוונטי</w:t>
+      </w:r>
+      <w:r>
+        <w:rPr>
+          <w:rtl/>
+        </w:rPr>
+        <w:t xml:space="preserve"> </w:t>
+      </w:r>
+      <w:r>
+        <w:rPr>
+          <w:rtl/>
+        </w:rPr>
+        <w:t xml:space="preserve">ומחקו את היתר.</w:t>
+      </w:r>
+    </w:p>
+    <w:p>
+      <w:pPr>
+        <w:pStyle w:val="BodyText"/>
+        <w:bidi/>
+        <w:jc w:val="right"/>
+      </w:pPr>
+      <w:r>
+        <w:rPr>
+          <w:bCs/>
+          <w:b/>
+          <w:rtl/>
+        </w:rPr>
+        <w:t xml:space="preserve">שם התפקיד / Role title</w:t>
+      </w:r>
+      <w:r>
+        <w:rPr>
+          <w:rtl/>
+        </w:rPr>
+        <w:t xml:space="preserve"> </w:t>
+      </w:r>
+      <w:r>
+        <w:rPr>
+          <w:rtl/>
+        </w:rPr>
+        <w:t xml:space="preserve">—</w:t>
+      </w:r>
+      <w:r>
+        <w:rPr>
+          <w:rtl/>
+        </w:rPr>
+        <w:t xml:space="preserve"> </w:t>
+      </w:r>
+      <w:r>
+        <w:rPr>
+          <w:iCs/>
+          <w:i/>
+          <w:rtl/>
+        </w:rPr>
+        <w:t xml:space="preserve">מה למלא:</w:t>
+      </w:r>
+      <w:r>
+        <w:rPr>
+          <w:rtl/>
+        </w:rPr>
+        <w:t xml:space="preserve"> </w:t>
+      </w:r>
+      <w:r>
+        <w:rPr>
+          <w:rtl/>
+        </w:rPr>
+        <w:t xml:space="preserve">התואר הרשמי (לדוגמה: סמנכ”ל כספים).</w:t>
+      </w:r>
+      <w:r>
+        <w:rPr>
+          <w:rtl/>
+        </w:rPr>
+        <w:t xml:space="preserve"> </w:t>
+      </w:r>
+      <w:r>
+        <w:rPr>
+          <w:rtl/>
+        </w:rPr>
+        <w:t>_______________________________________________________</w:t>
+      </w:r>
+    </w:p>
+    <w:p>
+      <w:pPr>
+        <w:pStyle w:val="BodyText"/>
+        <w:bidi/>
+        <w:jc w:val="right"/>
+      </w:pPr>
+      <w:r>
+        <w:rPr>
+          <w:bCs/>
+          <w:b/>
+          <w:rtl/>
+        </w:rPr>
+        <w:t xml:space="preserve">מיצוב התפקיד במשפט / Positioning (one line)</w:t>
+      </w:r>
+      <w:r>
+        <w:rPr>
+          <w:rtl/>
+        </w:rPr>
+        <w:t xml:space="preserve"> </w:t>
+      </w:r>
+      <w:r>
+        <w:rPr>
+          <w:rtl/>
+        </w:rPr>
+        <w:t xml:space="preserve">—</w:t>
+      </w:r>
+      <w:r>
+        <w:rPr>
+          <w:rtl/>
+        </w:rPr>
+        <w:t xml:space="preserve"> </w:t>
+      </w:r>
+      <w:r>
+        <w:rPr>
+          <w:iCs/>
+          <w:i/>
+          <w:rtl/>
+        </w:rPr>
+        <w:t xml:space="preserve">מה למלא:</w:t>
+      </w:r>
+      <w:r>
+        <w:rPr>
+          <w:rtl/>
+        </w:rPr>
+        <w:t xml:space="preserve"> </w:t>
+      </w:r>
+      <w:r>
+        <w:rPr>
+          <w:rtl/>
+        </w:rPr>
+        <w:t xml:space="preserve">תיאור בשורה אחת של</w:t>
+      </w:r>
+      <w:r>
+        <w:rPr>
+          <w:rtl/>
+        </w:rPr>
+        <w:t xml:space="preserve"> </w:t>
+      </w:r>
+      <w:r>
+        <w:rPr>
+          <w:rtl/>
+        </w:rPr>
+        <w:t xml:space="preserve">“</w:t>
+      </w:r>
+      <w:r>
+        <w:rPr>
+          <w:rtl/>
+        </w:rPr>
+        <w:t xml:space="preserve">הזרוע</w:t>
+      </w:r>
+      <w:r>
+        <w:rPr>
+          <w:rtl/>
+        </w:rPr>
+        <w:t xml:space="preserve">”</w:t>
+      </w:r>
+      <w:r>
+        <w:rPr>
+          <w:rtl/>
+        </w:rPr>
+        <w:t xml:space="preserve"> </w:t>
+      </w:r>
+      <w:r>
+        <w:rPr>
+          <w:rtl/>
+        </w:rPr>
+        <w:t xml:space="preserve">או הפונקציה שהתפקיד מוביל בחברה.</w:t>
+      </w:r>
+      <w:r>
+        <w:rPr>
+          <w:rtl/>
+        </w:rPr>
+        <w:t xml:space="preserve"> </w:t>
+      </w:r>
+      <w:r>
+        <w:rPr>
+          <w:rtl/>
+        </w:rPr>
+        <w:t>_______________________________________________________</w:t>
+      </w:r>
+    </w:p>
+    <w:p>
+      <w:pPr>
+        <w:pStyle w:val="BodyText"/>
+        <w:bidi/>
+        <w:jc w:val="right"/>
+      </w:pPr>
+      <w:r>
+        <w:rPr>
+          <w:bCs/>
+          <w:b/>
+          <w:rtl/>
+        </w:rPr>
+        <w:t xml:space="preserve">כפיפות / Reports to</w:t>
+      </w:r>
+      <w:r>
+        <w:rPr>
+          <w:rtl/>
+        </w:rPr>
+        <w:t xml:space="preserve"> </w:t>
+      </w:r>
+      <w:r>
+        <w:rPr>
+          <w:rtl/>
+        </w:rPr>
+        <w:t xml:space="preserve">—</w:t>
+      </w:r>
+      <w:r>
+        <w:rPr>
+          <w:rtl/>
+        </w:rPr>
+        <w:t xml:space="preserve"> </w:t>
+      </w:r>
+      <w:r>
+        <w:rPr>
+          <w:iCs/>
+          <w:i/>
+          <w:rtl/>
+        </w:rPr>
+        <w:t xml:space="preserve">מה למלא:</w:t>
+      </w:r>
+      <w:r>
+        <w:rPr>
+          <w:rtl/>
+        </w:rPr>
+        <w:t xml:space="preserve"> </w:t>
+      </w:r>
+      <w:r>
+        <w:rPr>
+          <w:rtl/>
+        </w:rPr>
+        <w:t xml:space="preserve">למי התפקיד כפוף ישירות.</w:t>
+      </w:r>
+      <w:r>
+        <w:rPr>
+          <w:rtl/>
+        </w:rPr>
+        <w:t xml:space="preserve"> </w:t>
+      </w:r>
+      <w:r>
+        <w:rPr>
+          <w:rtl/>
+        </w:rPr>
+        <w:t>_______________________________________________________</w:t>
+      </w:r>
+    </w:p>
+    <w:p>
+      <w:pPr>
+        <w:pStyle w:val="BodyText"/>
+        <w:bidi/>
+        <w:jc w:val="right"/>
+      </w:pPr>
+      <w:r>
+        <w:rPr>
+          <w:bCs/>
+          <w:b/>
+          <w:rtl/>
+        </w:rPr>
+        <w:t xml:space="preserve">כפופים ישירים / Direct reports</w:t>
+      </w:r>
+      <w:r>
+        <w:rPr>
+          <w:rtl/>
+        </w:rPr>
+        <w:t xml:space="preserve"> </w:t>
+      </w:r>
+      <w:r>
+        <w:rPr>
+          <w:rtl/>
+        </w:rPr>
+        <w:t xml:space="preserve">—</w:t>
+      </w:r>
+      <w:r>
+        <w:rPr>
+          <w:rtl/>
+        </w:rPr>
+        <w:t xml:space="preserve"> </w:t>
+      </w:r>
+      <w:r>
+        <w:rPr>
+          <w:iCs/>
+          <w:i/>
+          <w:rtl/>
+        </w:rPr>
+        <w:t xml:space="preserve">מה למלא:</w:t>
+      </w:r>
+      <w:r>
+        <w:rPr>
+          <w:rtl/>
+        </w:rPr>
+        <w:t xml:space="preserve"> </w:t>
+      </w:r>
+      <w:r>
+        <w:rPr>
+          <w:rtl/>
+        </w:rPr>
+        <w:t xml:space="preserve">אילו תפקידים כפופים לבעל התפקיד.</w:t>
+      </w:r>
+      <w:r>
+        <w:rPr>
+          <w:rtl/>
+        </w:rPr>
+        <w:t xml:space="preserve"> </w:t>
+      </w:r>
+      <w:r>
+        <w:rPr>
+          <w:rtl/>
+        </w:rPr>
+        <w:t>_______________________________________________________</w:t>
+      </w:r>
+    </w:p>
+    <w:p>
+      <w:pPr>
+        <w:pStyle w:val="BodyText"/>
+        <w:bidi/>
+        <w:jc w:val="right"/>
+      </w:pPr>
+      <w:r>
+        <w:rPr>
+          <w:bCs/>
+          <w:b/>
+          <w:rtl/>
+        </w:rPr>
+        <w:t xml:space="preserve">חטיבה / Division</w:t>
+      </w:r>
+      <w:r>
+        <w:rPr>
+          <w:rtl/>
+        </w:rPr>
+        <w:t xml:space="preserve"> </w:t>
+      </w:r>
+      <w:r>
+        <w:rPr>
+          <w:rtl/>
+        </w:rPr>
+        <w:t>— _______________________________________________________</w:t>
+      </w:r>
+      <w:r>
+        <w:rPr>
+          <w:rtl/>
+        </w:rPr>
+        <w:t xml:space="preserve"> </w:t>
+      </w:r>
+      <w:r>
+        <w:rPr>
+          <w:bCs/>
+          <w:b/>
+          <w:rtl/>
+        </w:rPr>
+        <w:t xml:space="preserve">תאריך / Date</w:t>
+      </w:r>
+      <w:r>
+        <w:rPr>
+          <w:rtl/>
+        </w:rPr>
+        <w:t xml:space="preserve"> </w:t>
+      </w:r>
+      <w:r>
+        <w:rPr>
+          <w:rtl/>
+        </w:rPr>
+        <w:t>— _______________________________________________________</w:t>
+      </w:r>
+    </w:p>
+    <w:p>
+      <w:pPr>
+        <w:bidi/>
+        <w:jc w:val="right"/>
+      </w:pPr>
+      <w:r>
+        <w:rPr>
+          <w:rtl/>
+        </w:rPr>
+        <w:pict>
+          <v:rect style="width:0;height:1.5pt" o:hralign="center" o:hrstd="t" o:hr="t"/>
+        </w:pict>
+      </w:r>
+    </w:p>
+    <w:bookmarkStart w:id="20" w:name="ייעוד-התפקיד-role-purpose"/>
+    <w:p>
+      <w:pPr>
+        <w:pStyle w:val="Heading2"/>
+        <w:bidi/>
+        <w:jc w:val="right"/>
+      </w:pPr>
+      <w:r>
+        <w:rPr>
+          <w:rtl/>
+        </w:rPr>
+        <w:t xml:space="preserve">1. ייעוד התפקיד · Role Purpose</w:t>
+      </w:r>
+    </w:p>
+    <w:p>
+      <w:pPr>
+        <w:pStyle w:val="FirstParagraph"/>
+        <w:bidi/>
+        <w:jc w:val="right"/>
+      </w:pPr>
+      <w:r>
+        <w:rPr>
+          <w:iCs/>
+          <w:i/>
+          <w:rtl/>
+        </w:rPr>
+        <w:t xml:space="preserve">מה למלא:</w:t>
+      </w:r>
+      <w:r>
+        <w:rPr>
+          <w:rtl/>
+        </w:rPr>
+        <w:t xml:space="preserve"> </w:t>
+      </w:r>
+      <w:r>
+        <w:rPr>
+          <w:rtl/>
+        </w:rPr>
+        <w:t xml:space="preserve">2–3 פסקאות קצרות המתארות את המנדט של התפקיד — מה הוא מחזיק מקצה לקצה,</w:t>
+      </w:r>
+      <w:r>
+        <w:rPr>
+          <w:rtl/>
+        </w:rPr>
+        <w:t xml:space="preserve"> </w:t>
+      </w:r>
+      <w:r>
+        <w:rPr>
+          <w:rtl/>
+        </w:rPr>
+        <w:t xml:space="preserve">מהו היקף האחריות שלו בחברה, עם מי הוא עובד בשיתוף אסטרטגי, ולפי איזה סטנדרט הוא</w:t>
+      </w:r>
+      <w:r>
+        <w:rPr>
+          <w:rtl/>
+        </w:rPr>
+        <w:t xml:space="preserve"> </w:t>
+      </w:r>
+      <w:r>
+        <w:rPr>
+          <w:rtl/>
+        </w:rPr>
+        <w:t xml:space="preserve">נמדד. כתבו מנדט, לא רשימת משימות (המשימות נכנסות בחלק 2).</w:t>
+      </w:r>
+    </w:p>
+    <w:p>
+      <w:pPr>
+        <w:pStyle w:val="BodyText"/>
+        <w:bidi/>
+        <w:jc w:val="right"/>
+      </w:pPr>
+      <w:r>
+        <w:rPr>
+          <w:rtl/>
+        </w:rPr>
+        <w:t>_______________________________________________________</w:t>
+      </w:r>
+      <w:r>
+        <w:rPr>
+          <w:rtl/>
+        </w:rPr>
+        <w:t xml:space="preserve"> </w:t>
+      </w:r>
+      <w:r>
+        <w:rPr>
+          <w:rtl/>
+        </w:rPr>
+        <w:t>_______________________________________________________</w:t>
+      </w:r>
+      <w:r>
+        <w:rPr>
+          <w:rtl/>
+        </w:rPr>
+        <w:t xml:space="preserve"> </w:t>
+      </w:r>
+      <w:r>
+        <w:rPr>
+          <w:rtl/>
+        </w:rPr>
+        <w:t>_______________________________________________________</w:t>
+      </w:r>
+      <w:r>
+        <w:rPr>
+          <w:rtl/>
+        </w:rPr>
+        <w:t xml:space="preserve"> </w:t>
+      </w:r>
+      <w:r>
+        <w:rPr>
+          <w:rtl/>
+        </w:rPr>
+        <w:t>_______________________________________________________</w:t>
+      </w:r>
+      <w:r>
+        <w:rPr>
+          <w:rtl/>
+        </w:rPr>
+        <w:t xml:space="preserve"> </w:t>
+      </w:r>
+      <w:r>
+        <w:rPr>
+          <w:rtl/>
+        </w:rPr>
+      </w:r>
+    </w:p>
+    <w:p>
+      <w:pPr>
+        <w:bidi/>
+        <w:jc w:val="right"/>
+      </w:pPr>
+      <w:r>
+        <w:rPr>
+          <w:rtl/>
+        </w:rPr>
+        <w:pict>
+          <v:rect style="width:0;height:1.5pt" o:hralign="center" o:hrstd="t" o:hr="t"/>
+        </w:pict>
+      </w:r>
+    </w:p>
+    <w:bookmarkEnd w:id="20"/>
+    <w:bookmarkStart w:id="23" w:name="X121f918db49bcedc00c11464f237d8c82fb8d29"/>
+    <w:p>
+      <w:pPr>
+        <w:pStyle w:val="Heading2"/>
+        <w:bidi/>
+        <w:jc w:val="right"/>
+      </w:pPr>
+      <w:r>
+        <w:rPr>
+          <w:rtl/>
+        </w:rPr>
+        <w:t xml:space="preserve">2. תחומי אחריות מרכזיים · Key Responsibility Areas</w:t>
+      </w:r>
+    </w:p>
+    <w:p>
+      <w:pPr>
+        <w:pStyle w:val="FirstParagraph"/>
+        <w:bidi/>
+        <w:jc w:val="right"/>
+      </w:pPr>
+      <w:r>
+        <w:rPr>
+          <w:iCs/>
+          <w:i/>
+          <w:rtl/>
+        </w:rPr>
+        <w:t xml:space="preserve">מה למלא:</w:t>
+      </w:r>
+      <w:r>
+        <w:rPr>
+          <w:rtl/>
+        </w:rPr>
+        <w:t xml:space="preserve"> </w:t>
+      </w:r>
+      <w:r>
+        <w:rPr>
+          <w:rtl/>
+        </w:rPr>
+        <w:t xml:space="preserve">זהו לב המסמך. קבצו את האחריות תחת כותרות-תחום ברורות (בדרך כלל 4–8</w:t>
+      </w:r>
+      <w:r>
+        <w:rPr>
+          <w:rtl/>
+        </w:rPr>
+        <w:t xml:space="preserve"> </w:t>
+      </w:r>
+      <w:r>
+        <w:rPr>
+          <w:rtl/>
+        </w:rPr>
+        <w:t xml:space="preserve">תחומים). תחת כל תחום, רשמו מטלות קונקרטיות ושאפשר להחזיק בהן בעלות. שכפלו את הבלוק</w:t>
+      </w:r>
+      <w:r>
+        <w:rPr>
+          <w:rtl/>
+        </w:rPr>
+        <w:t xml:space="preserve"> </w:t>
+      </w:r>
+      <w:r>
+        <w:rPr>
+          <w:rtl/>
+        </w:rPr>
+        <w:t xml:space="preserve">לכל תחום נוסף.</w:t>
+      </w:r>
+    </w:p>
+    <w:bookmarkStart w:id="21" w:name="תחום-אחריות-responsibility-area-שם-name"/>
+    <w:p>
+      <w:pPr>
+        <w:pStyle w:val="Heading4"/>
+        <w:bidi/>
+        <w:jc w:val="right"/>
+      </w:pPr>
+      <w:r>
+        <w:rPr>
+          <w:rtl/>
+        </w:rPr>
+        <w:t xml:space="preserve">תחום אחריות / Responsibility area — שם / Name:</w:t>
+      </w:r>
+    </w:p>
+    <w:p>
+      <w:pPr>
+        <w:pStyle w:val="FirstParagraph"/>
+        <w:bidi/>
+        <w:jc w:val="right"/>
+      </w:pPr>
+      <w:r>
+        <w:rPr>
+          <w:rtl/>
+        </w:rPr>
+        <w:t>_______________________________________________________</w:t>
+      </w:r>
+    </w:p>
+    <w:p>
+      <w:pPr>
+        <w:pStyle w:val="BodyText"/>
+        <w:bidi/>
+        <w:jc w:val="right"/>
+      </w:pPr>
+      <w:r>
+        <w:rPr>
+          <w:rtl/>
+        </w:rPr>
+        <w:t xml:space="preserve">מטלות / Duties:</w:t>
+      </w:r>
+      <w:r>
+        <w:rPr>
+          <w:rtl/>
+        </w:rPr>
+        <w:t xml:space="preserve"> </w:t>
+      </w:r>
+      <w:r>
+        <w:rPr>
+          <w:rtl/>
+        </w:rPr>
+        <w:t>_______________________________________________________</w:t>
+      </w:r>
+      <w:r>
+        <w:rPr>
+          <w:rtl/>
+        </w:rPr>
+        <w:t xml:space="preserve"> </w:t>
+      </w:r>
+      <w:r>
+        <w:rPr>
+          <w:rtl/>
+        </w:rPr>
+        <w:t>_______________________________________________________</w:t>
+      </w:r>
+      <w:r>
+        <w:rPr>
+          <w:rtl/>
+        </w:rPr>
+        <w:t xml:space="preserve"> </w:t>
+      </w:r>
+      <w:r>
+        <w:rPr>
+          <w:rtl/>
+        </w:rPr>
+        <w:t>_______________________________________________________</w:t>
+      </w:r>
+      <w:r>
+        <w:rPr>
+          <w:rtl/>
+        </w:rPr>
+        <w:t xml:space="preserve"> </w:t>
+      </w:r>
+      <w:r>
+        <w:rPr>
+          <w:rtl/>
+        </w:rPr>
+      </w:r>
+    </w:p>
+    <w:bookmarkEnd w:id="21"/>
+    <w:bookmarkStart w:id="22" w:name="Xe7793f2ab3416fd96a65f1ba407e38e12ed9ead"/>
+    <w:p>
+      <w:pPr>
+        <w:pStyle w:val="Heading4"/>
+        <w:bidi/>
+        <w:jc w:val="right"/>
+      </w:pPr>
+      <w:r>
+        <w:rPr>
+          <w:rtl/>
+        </w:rPr>
+        <w:t xml:space="preserve">תחום אחריות / Responsibility area — שם / Name:</w:t>
+      </w:r>
+    </w:p>
+    <w:p>
+      <w:pPr>
+        <w:pStyle w:val="FirstParagraph"/>
+        <w:bidi/>
+        <w:jc w:val="right"/>
+      </w:pPr>
+      <w:r>
+        <w:rPr>
+          <w:rtl/>
+        </w:rPr>
+        <w:t>_______________________________________________________</w:t>
+      </w:r>
+    </w:p>
+    <w:p>
+      <w:pPr>
+        <w:pStyle w:val="BodyText"/>
+        <w:bidi/>
+        <w:jc w:val="right"/>
+      </w:pPr>
+      <w:r>
+        <w:rPr>
+          <w:rtl/>
+        </w:rPr>
+        <w:t xml:space="preserve">מטלות / Duties:</w:t>
+      </w:r>
+      <w:r>
+        <w:rPr>
+          <w:rtl/>
+        </w:rPr>
+        <w:t xml:space="preserve"> </w:t>
+      </w:r>
+      <w:r>
+        <w:rPr>
+          <w:rtl/>
+        </w:rPr>
+        <w:t>_______________________________________________________</w:t>
+      </w:r>
+      <w:r>
+        <w:rPr>
+          <w:rtl/>
+        </w:rPr>
+        <w:t xml:space="preserve"> </w:t>
+      </w:r>
+      <w:r>
+        <w:rPr>
+          <w:rtl/>
+        </w:rPr>
+        <w:t>_______________________________________________________</w:t>
+      </w:r>
+      <w:r>
+        <w:rPr>
+          <w:rtl/>
+        </w:rPr>
+        <w:t xml:space="preserve"> </w:t>
+      </w:r>
+      <w:r>
+        <w:rPr>
+          <w:rtl/>
+        </w:rPr>
+        <w:t>_______________________________________________________</w:t>
+      </w:r>
+      <w:r>
+        <w:rPr>
+          <w:rtl/>
+        </w:rPr>
+        <w:t xml:space="preserve"> </w:t>
+      </w:r>
+      <w:r>
+        <w:rPr>
+          <w:rtl/>
+        </w:rPr>
+      </w:r>
+    </w:p>
+    <w:p>
+      <w:pPr>
+        <w:pStyle w:val="BodyText"/>
+        <w:bidi/>
+        <w:jc w:val="right"/>
+      </w:pPr>
+      <w:r>
+        <w:rPr>
+          <w:iCs/>
+          <w:i/>
+          <w:rtl/>
+        </w:rPr>
+        <w:t xml:space="preserve">(שכפלו את הבלוק לעיל עבור כל תחום אחריות נוסף.)</w:t>
+      </w:r>
+    </w:p>
+    <w:p>
+      <w:pPr>
+        <w:bidi/>
+        <w:jc w:val="right"/>
+      </w:pPr>
+      <w:r>
+        <w:rPr>
+          <w:rtl/>
+        </w:rPr>
+        <w:pict>
+          <v:rect style="width:0;height:1.5pt" o:hralign="center" o:hrstd="t" o:hr="t"/>
+        </w:pict>
+      </w:r>
+    </w:p>
+    <w:bookmarkEnd w:id="22"/>
+    <w:bookmarkEnd w:id="23"/>
+    <w:bookmarkStart w:id="24" w:name="X3764d40f020fd9965432ebd92f5fe054eed12e2"/>
+    <w:p>
+      <w:pPr>
+        <w:pStyle w:val="Heading2"/>
+        <w:bidi/>
+        <w:jc w:val="right"/>
+      </w:pPr>
+      <w:r>
+        <w:rPr>
+          <w:rtl/>
+        </w:rPr>
+        <w:t xml:space="preserve">3. ממשקים מרכזיים · Key Interfaces</w:t>
+      </w:r>
+      <w:r>
+        <w:rPr>
+          <w:rtl/>
+        </w:rPr>
+        <w:t xml:space="preserve"> </w:t>
+      </w:r>
+      <w:r>
+        <w:rPr>
+          <w:iCs/>
+          <w:i/>
+          <w:rtl/>
+        </w:rPr>
+        <w:t xml:space="preserve">(אופציונלי / optional)</w:t>
+      </w:r>
+    </w:p>
+    <w:p>
+      <w:pPr>
+        <w:pStyle w:val="FirstParagraph"/>
+        <w:bidi/>
+        <w:jc w:val="right"/>
+      </w:pPr>
+      <w:r>
+        <w:rPr>
+          <w:iCs/>
+          <w:i/>
+          <w:rtl/>
+        </w:rPr>
+        <w:t xml:space="preserve">מה למלא:</w:t>
+      </w:r>
+      <w:r>
+        <w:rPr>
+          <w:rtl/>
+        </w:rPr>
+        <w:t xml:space="preserve"> </w:t>
+      </w:r>
+      <w:r>
+        <w:rPr>
+          <w:rtl/>
+        </w:rPr>
+        <w:t xml:space="preserve">גורמים פנימיים וחיצוניים שאיתם התפקיד עובד באופן קבוע, ומטרת כל ממשק.</w:t>
       </w:r>
     </w:p>
     <w:tbl>
       <w:tblPr>
         <w:tblStyle w:val="Table"/>
-        <w:tblW w:type="pct" w:w="5000"/>
-        <w:tblLook w:firstRow="0" w:lastRow="0" w:firstColumn="0" w:lastColumn="0" w:noHBand="0" w:noVBand="0" w:val="0000"/>
-        <w:jc w:val="start"/>
-      </w:tblPr>
-      <w:tblGrid>
-        <w:gridCol w:w="3960"/>
-        <w:gridCol w:w="3960"/>
-      </w:tblGrid>
-      <w:tr>
-        <w:tc>
-          <w:tcPr/>
-          <w:p>
-            <w:pPr>
-              <w:pStyle w:val="Compact"/>
-              <w:jc w:val="left"/>
-            </w:pPr>
-            <w:r>
-              <w:rPr>
-                <w:bCs/>
-                <w:b/>
-              </w:rPr>
-              <w:t xml:space="preserve">שם התפקיד / Role title</w:t>
-            </w:r>
-          </w:p>
-        </w:tc>
-        <w:tc>
-          <w:tcPr/>
-          <w:p>
-            <w:pPr>
-              <w:pStyle w:val="Compact"/>
-              <w:jc w:val="left"/>
-            </w:pPr>
-            <w:r>
-              <w:t xml:space="preserve">[להשלמה / TO FILL: e.g. סמנכ”ל כספים (CFO)]</w:t>
-            </w:r>
-          </w:p>
-        </w:tc>
-      </w:tr>
-      <w:tr>
-        <w:tc>
-          <w:tcPr/>
-          <w:p>
-            <w:pPr>
-              <w:pStyle w:val="Compact"/>
-              <w:jc w:val="left"/>
-            </w:pPr>
-            <w:r>
-              <w:rPr>
-                <w:bCs/>
-                <w:b/>
-              </w:rPr>
-              <w:t xml:space="preserve">מיצוב / Positioning (one line)</w:t>
-            </w:r>
-          </w:p>
-        </w:tc>
-        <w:tc>
-          <w:tcPr/>
-          <w:p>
-            <w:pPr>
-              <w:pStyle w:val="Compact"/>
-              <w:jc w:val="left"/>
-            </w:pPr>
-            <w:r>
-              <w:t xml:space="preserve">[להשלמה / TO FILL: the role’s</w:t>
-            </w:r>
-            <w:r>
-              <w:t xml:space="preserve"> </w:t>
-            </w:r>
-            <w:r>
-              <w:t xml:space="preserve">“</w:t>
-            </w:r>
-            <w:r>
-              <w:t xml:space="preserve">arm</w:t>
-            </w:r>
-            <w:r>
-              <w:t xml:space="preserve">”</w:t>
-            </w:r>
-            <w:r>
-              <w:t xml:space="preserve">/function in one line]</w:t>
-            </w:r>
-          </w:p>
-        </w:tc>
-      </w:tr>
-      <w:tr>
-        <w:tc>
-          <w:tcPr/>
-          <w:p>
-            <w:pPr>
-              <w:pStyle w:val="Compact"/>
-              <w:jc w:val="left"/>
-            </w:pPr>
-            <w:r>
-              <w:rPr>
-                <w:bCs/>
-                <w:b/>
-              </w:rPr>
-              <w:t xml:space="preserve">כפיפות / Reports to</w:t>
-            </w:r>
-          </w:p>
-        </w:tc>
-        <w:tc>
-          <w:tcPr/>
-          <w:p>
-            <w:pPr>
-              <w:pStyle w:val="Compact"/>
-              <w:jc w:val="left"/>
-            </w:pPr>
-            <w:r>
-              <w:t xml:space="preserve">[להשלמה / TO FILL]</w:t>
-            </w:r>
-          </w:p>
-        </w:tc>
-      </w:tr>
-      <w:tr>
-        <w:tc>
-          <w:tcPr/>
-          <w:p>
-            <w:pPr>
-              <w:pStyle w:val="Compact"/>
-              <w:jc w:val="left"/>
-            </w:pPr>
-            <w:r>
-              <w:rPr>
-                <w:bCs/>
-                <w:b/>
-              </w:rPr>
-              <w:t xml:space="preserve">כפופים ישירים / Direct reports</w:t>
-            </w:r>
-          </w:p>
-        </w:tc>
-        <w:tc>
-          <w:tcPr/>
-          <w:p>
-            <w:pPr>
-              <w:pStyle w:val="Compact"/>
-              <w:jc w:val="left"/>
-            </w:pPr>
-            <w:r>
-              <w:t xml:space="preserve">[להשלמה / TO FILL]</w:t>
-            </w:r>
-          </w:p>
-        </w:tc>
-      </w:tr>
-      <w:tr>
-        <w:tc>
-          <w:tcPr/>
-          <w:p>
-            <w:pPr>
-              <w:pStyle w:val="Compact"/>
-              <w:jc w:val="left"/>
-            </w:pPr>
-            <w:r>
-              <w:rPr>
-                <w:bCs/>
-                <w:b/>
-              </w:rPr>
-              <w:t xml:space="preserve">חטיבה / Division</w:t>
-            </w:r>
-          </w:p>
-        </w:tc>
-        <w:tc>
-          <w:tcPr/>
-          <w:p>
-            <w:pPr>
-              <w:pStyle w:val="Compact"/>
-              <w:jc w:val="left"/>
-            </w:pPr>
-            <w:r>
-              <w:t xml:space="preserve">[להשלמה / TO FILL]</w:t>
-            </w:r>
-          </w:p>
-        </w:tc>
-      </w:tr>
-      <w:tr>
-        <w:tc>
-          <w:tcPr/>
-          <w:p>
-            <w:pPr>
-              <w:pStyle w:val="Compact"/>
-              <w:jc w:val="left"/>
-            </w:pPr>
-            <w:r>
-              <w:rPr>
-                <w:bCs/>
-                <w:b/>
-              </w:rPr>
-              <w:t xml:space="preserve">תאריך / Date</w:t>
-            </w:r>
-          </w:p>
-        </w:tc>
-        <w:tc>
-          <w:tcPr/>
-          <w:p>
-            <w:pPr>
-              <w:pStyle w:val="Compact"/>
-              <w:jc w:val="left"/>
-            </w:pPr>
-            <w:r>
-              <w:t xml:space="preserve">[להשלמה / TO FILL]</w:t>
-            </w:r>
-          </w:p>
-        </w:tc>
-      </w:tr>
-    </w:tbl>
-    <w:p>
-      <w:r>
-        <w:pict>
-          <v:rect style="width:0;height:1.5pt" o:hralign="center" o:hrstd="t" o:hr="t"/>
-        </w:pict>
-      </w:r>
-    </w:p>
-    <w:bookmarkStart w:id="20" w:name="ייעוד-התפקיד-role-purpose"/>
-    <w:p>
-      <w:pPr>
-        <w:pStyle w:val="Heading2"/>
-      </w:pPr>
-      <w:r>
-        <w:t xml:space="preserve">1. ייעוד התפקיד · Role Purpose</w:t>
-      </w:r>
-    </w:p>
-    <w:p>
-      <w:pPr>
-        <w:pStyle w:val="BlockText"/>
-      </w:pPr>
-      <w:r>
-        <w:rPr>
-          <w:iCs/>
-          <w:i/>
-        </w:rPr>
-        <w:t xml:space="preserve">Guidance: 1–3 short paragraphs. What the role owns end-to-end, its scope</w:t>
-      </w:r>
-      <w:r>
-        <w:rPr>
-          <w:iCs/>
-          <w:i/>
-        </w:rPr>
-        <w:t xml:space="preserve"> </w:t>
-      </w:r>
-      <w:r>
-        <w:rPr>
-          <w:iCs/>
-          <w:i/>
-        </w:rPr>
-        <w:t xml:space="preserve">across the business, who it partners with strategically, and the standard it is</w:t>
-      </w:r>
-      <w:r>
-        <w:rPr>
-          <w:iCs/>
-          <w:i/>
-        </w:rPr>
-        <w:t xml:space="preserve"> </w:t>
-      </w:r>
-      <w:r>
-        <w:rPr>
-          <w:iCs/>
-          <w:i/>
-        </w:rPr>
-        <w:t xml:space="preserve">held to. State the mandate, not a task list (tasks go in Section 2).</w:t>
-      </w:r>
-    </w:p>
-    <w:p>
-      <w:pPr>
-        <w:pStyle w:val="FirstParagraph"/>
-      </w:pPr>
-      <w:r>
-        <w:t xml:space="preserve">[להשלמה / TO FILL]</w:t>
-      </w:r>
-    </w:p>
-    <w:p>
-      <w:r>
-        <w:pict>
-          <v:rect style="width:0;height:1.5pt" o:hralign="center" o:hrstd="t" o:hr="t"/>
-        </w:pict>
-      </w:r>
-    </w:p>
-    <w:bookmarkEnd w:id="20"/>
-    <w:bookmarkStart w:id="23" w:name="X121f918db49bcedc00c11464f237d8c82fb8d29"/>
-    <w:p>
-      <w:pPr>
-        <w:pStyle w:val="Heading2"/>
-      </w:pPr>
-      <w:r>
-        <w:t xml:space="preserve">2. תחומי אחריות מרכזיים · Key Responsibility Areas</w:t>
-      </w:r>
-    </w:p>
-    <w:p>
-      <w:pPr>
-        <w:pStyle w:val="BlockText"/>
-      </w:pPr>
-      <w:r>
-        <w:rPr>
-          <w:iCs/>
-          <w:i/>
-        </w:rPr>
-        <w:t xml:space="preserve">Guidance: This is the core of the document. Group responsibilities under</w:t>
-      </w:r>
-      <w:r>
-        <w:rPr>
-          <w:iCs/>
-          <w:i/>
-        </w:rPr>
-        <w:t xml:space="preserve"> </w:t>
-      </w:r>
-      <w:r>
-        <w:rPr>
-          <w:iCs/>
-          <w:i/>
-        </w:rPr>
-        <w:t xml:space="preserve">clear AREA headers (typically 4–8 areas). Under each, list concrete, ownable</w:t>
-      </w:r>
-      <w:r>
-        <w:rPr>
-          <w:iCs/>
-          <w:i/>
-        </w:rPr>
-        <w:t xml:space="preserve"> </w:t>
-      </w:r>
-      <w:r>
-        <w:rPr>
-          <w:iCs/>
-          <w:i/>
-        </w:rPr>
-        <w:t xml:space="preserve">duties. Repeat the block below per area.</w:t>
-      </w:r>
-    </w:p>
-    <w:bookmarkStart w:id="21" w:name="X0bd9f6aeb9afee5be24a8ca74ac5e0df08196c0"/>
-    <w:p>
-      <w:pPr>
-        <w:pStyle w:val="Heading3"/>
-      </w:pPr>
-      <w:r>
-        <w:t xml:space="preserve">2.x [להשלמה / TO FILL: responsibility area name]</w:t>
-      </w:r>
-    </w:p>
-    <w:p>
-      <w:pPr>
-        <w:numPr>
-          <w:ilvl w:val="0"/>
-          <w:numId w:val="1001"/>
-        </w:numPr>
-        <w:pStyle w:val="Compact"/>
-      </w:pPr>
-      <w:r>
-        <w:t xml:space="preserve">[להשלמה / TO FILL: concrete duty]</w:t>
-      </w:r>
-    </w:p>
-    <w:p>
-      <w:pPr>
-        <w:numPr>
-          <w:ilvl w:val="0"/>
-          <w:numId w:val="1001"/>
-        </w:numPr>
-        <w:pStyle w:val="Compact"/>
-      </w:pPr>
-      <w:r>
-        <w:t xml:space="preserve">[להשלמה / TO FILL: concrete duty]</w:t>
-      </w:r>
-    </w:p>
-    <w:p>
-      <w:pPr>
-        <w:numPr>
-          <w:ilvl w:val="0"/>
-          <w:numId w:val="1001"/>
-        </w:numPr>
-        <w:pStyle w:val="Compact"/>
-      </w:pPr>
-      <w:r>
-        <w:t xml:space="preserve">[להשלמה / TO FILL: concrete duty]</w:t>
-      </w:r>
-    </w:p>
-    <w:bookmarkEnd w:id="21"/>
-    <w:bookmarkStart w:id="22" w:name="X070042046d692a35ffeb8354b40c8669ff36eb3"/>
-    <w:p>
-      <w:pPr>
-        <w:pStyle w:val="Heading3"/>
-      </w:pPr>
-      <w:r>
-        <w:t xml:space="preserve">2.x [להשלמה / TO FILL: responsibility area name]</w:t>
-      </w:r>
-    </w:p>
-    <w:p>
-      <w:pPr>
-        <w:numPr>
-          <w:ilvl w:val="0"/>
-          <w:numId w:val="1002"/>
-        </w:numPr>
-        <w:pStyle w:val="Compact"/>
-      </w:pPr>
-      <w:r>
-        <w:t xml:space="preserve">[להשלמה / TO FILL]</w:t>
-      </w:r>
-    </w:p>
-    <w:p>
-      <w:pPr>
-        <w:numPr>
-          <w:ilvl w:val="0"/>
-          <w:numId w:val="1002"/>
-        </w:numPr>
-        <w:pStyle w:val="Compact"/>
-      </w:pPr>
-      <w:r>
-        <w:t xml:space="preserve">[להשלמה / TO FILL]</w:t>
-      </w:r>
-    </w:p>
-    <w:p>
-      <w:pPr>
-        <w:pStyle w:val="FirstParagraph"/>
-      </w:pPr>
-      <w:r>
-        <w:rPr>
-          <w:iCs/>
-          <w:i/>
-        </w:rPr>
-        <w:t xml:space="preserve">(Duplicate 2.x for each additional area.)</w:t>
-      </w:r>
-    </w:p>
-    <w:p>
-      <w:r>
-        <w:pict>
-          <v:rect style="width:0;height:1.5pt" o:hralign="center" o:hrstd="t" o:hr="t"/>
-        </w:pict>
-      </w:r>
-    </w:p>
-    <w:bookmarkEnd w:id="22"/>
-    <w:bookmarkEnd w:id="23"/>
-    <w:bookmarkStart w:id="24" w:name="ממשקים-מרכזיים-key-interfaces-optional"/>
-    <w:p>
-      <w:pPr>
-        <w:pStyle w:val="Heading2"/>
-      </w:pPr>
-      <w:r>
-        <w:t xml:space="preserve">3. ממשקים מרכזיים · Key Interfaces</w:t>
-      </w:r>
-      <w:r>
-        <w:t xml:space="preserve"> </w:t>
-      </w:r>
-      <w:r>
-        <w:rPr>
-          <w:iCs/>
-          <w:i/>
-        </w:rPr>
-        <w:t xml:space="preserve">(optional)</w:t>
-      </w:r>
-    </w:p>
-    <w:p>
-      <w:pPr>
-        <w:pStyle w:val="BlockText"/>
-      </w:pPr>
-      <w:r>
-        <w:rPr>
-          <w:iCs/>
-          <w:i/>
-        </w:rPr>
-        <w:t xml:space="preserve">Guidance: Internal and external parties this role works with regularly, and</w:t>
-      </w:r>
-      <w:r>
-        <w:rPr>
-          <w:iCs/>
-          <w:i/>
-        </w:rPr>
-        <w:t xml:space="preserve"> </w:t>
-      </w:r>
-      <w:r>
-        <w:rPr>
-          <w:iCs/>
-          <w:i/>
-        </w:rPr>
-        <w:t xml:space="preserve">the purpose of each interface.</w:t>
-      </w:r>
-    </w:p>
-    <w:tbl>
-      <w:tblPr>
-        <w:tblStyle w:val="Table"/>
-        <w:tblW w:type="pct" w:w="5000"/>
+        <w:tblW w:type="auto" w:w="0"/>
         <w:tblLook w:firstRow="1" w:lastRow="0" w:firstColumn="0" w:lastColumn="0" w:noHBand="0" w:noVBand="0" w:val="0020"/>
         <w:jc w:val="start"/>
+        <w:bidiVisual/>
       </w:tblPr>
       <w:tblGrid>
         <w:gridCol w:w="2640"/>
@@ -505,9 +918,13 @@
           <w:p>
             <w:pPr>
               <w:pStyle w:val="Compact"/>
-              <w:jc w:val="left"/>
+              <w:bidi/>
+              <w:jc w:val="right"/>
             </w:pPr>
             <w:r>
+              <w:rPr>
+                <w:rtl/>
+              </w:rPr>
               <w:t xml:space="preserve">גורם / Party</w:t>
             </w:r>
           </w:p>
@@ -517,10 +934,14 @@
           <w:p>
             <w:pPr>
               <w:pStyle w:val="Compact"/>
-              <w:jc w:val="left"/>
+              <w:bidi/>
+              <w:jc w:val="right"/>
             </w:pPr>
             <w:r>
-              <w:t xml:space="preserve">פנימי/חיצוני (Internal/External)</w:t>
+              <w:rPr>
+                <w:rtl/>
+              </w:rPr>
+              <w:t xml:space="preserve">פנימי/חיצוני</w:t>
             </w:r>
           </w:p>
         </w:tc>
@@ -529,9 +950,13 @@
           <w:p>
             <w:pPr>
               <w:pStyle w:val="Compact"/>
-              <w:jc w:val="left"/>
+              <w:bidi/>
+              <w:jc w:val="right"/>
             </w:pPr>
             <w:r>
+              <w:rPr>
+                <w:rtl/>
+              </w:rPr>
               <w:t xml:space="preserve">מטרת הממשק / Purpose</w:t>
             </w:r>
           </w:p>
@@ -543,10 +968,14 @@
           <w:p>
             <w:pPr>
               <w:pStyle w:val="Compact"/>
-              <w:jc w:val="left"/>
+              <w:bidi/>
+              <w:jc w:val="right"/>
             </w:pPr>
             <w:r>
-              <w:t xml:space="preserve">[TO FILL]</w:t>
+              <w:rPr>
+                <w:rtl/>
+              </w:rPr>
+              <w:t>_______________________________________________________</w:t>
             </w:r>
           </w:p>
         </w:tc>
@@ -555,10 +984,14 @@
           <w:p>
             <w:pPr>
               <w:pStyle w:val="Compact"/>
-              <w:jc w:val="left"/>
+              <w:bidi/>
+              <w:jc w:val="right"/>
             </w:pPr>
             <w:r>
-              <w:t xml:space="preserve">[TO FILL]</w:t>
+              <w:rPr>
+                <w:rtl/>
+              </w:rPr>
+              <w:t>_______________________________________________________</w:t>
             </w:r>
           </w:p>
         </w:tc>
@@ -567,10 +1000,14 @@
           <w:p>
             <w:pPr>
               <w:pStyle w:val="Compact"/>
-              <w:jc w:val="left"/>
+              <w:bidi/>
+              <w:jc w:val="right"/>
             </w:pPr>
             <w:r>
-              <w:t xml:space="preserve">[TO FILL]</w:t>
+              <w:rPr>
+                <w:rtl/>
+              </w:rPr>
+              <w:t>_______________________________________________________</w:t>
             </w:r>
           </w:p>
         </w:tc>
@@ -581,10 +1018,14 @@
           <w:p>
             <w:pPr>
               <w:pStyle w:val="Compact"/>
-              <w:jc w:val="left"/>
+              <w:bidi/>
+              <w:jc w:val="right"/>
             </w:pPr>
             <w:r>
-              <w:t xml:space="preserve">[TO FILL]</w:t>
+              <w:rPr>
+                <w:rtl/>
+              </w:rPr>
+              <w:t>_______________________________________________________</w:t>
             </w:r>
           </w:p>
         </w:tc>
@@ -593,10 +1034,14 @@
           <w:p>
             <w:pPr>
               <w:pStyle w:val="Compact"/>
-              <w:jc w:val="left"/>
+              <w:bidi/>
+              <w:jc w:val="right"/>
             </w:pPr>
             <w:r>
-              <w:t xml:space="preserve">[TO FILL]</w:t>
+              <w:rPr>
+                <w:rtl/>
+              </w:rPr>
+              <w:t>_______________________________________________________</w:t>
             </w:r>
           </w:p>
         </w:tc>
@@ -605,362 +1050,444 @@
           <w:p>
             <w:pPr>
               <w:pStyle w:val="Compact"/>
-              <w:jc w:val="left"/>
+              <w:bidi/>
+              <w:jc w:val="right"/>
             </w:pPr>
             <w:r>
-              <w:t xml:space="preserve">[TO FILL]</w:t>
+              <w:rPr>
+                <w:rtl/>
+              </w:rPr>
+              <w:t>_______________________________________________________</w:t>
             </w:r>
           </w:p>
         </w:tc>
       </w:tr>
     </w:tbl>
+    <w:p>
+      <w:pPr>
+        <w:pStyle w:val="BodyText"/>
+        <w:bidi/>
+        <w:jc w:val="right"/>
+      </w:pPr>
+      <w:r>
+        <w:rPr>
+          <w:rtl/>
+        </w:rPr>
+      </w:r>
+    </w:p>
     <w:bookmarkEnd w:id="24"/>
-    <w:bookmarkStart w:id="25" w:name="מדדי-הצלחה-success-metrics-kpis-optional"/>
+    <w:bookmarkStart w:id="25" w:name="X264f2a85f389ed5fcb578865706e7a33efb0267"/>
     <w:p>
       <w:pPr>
         <w:pStyle w:val="Heading2"/>
-      </w:pPr>
-      <w:r>
+        <w:bidi/>
+        <w:jc w:val="right"/>
+      </w:pPr>
+      <w:r>
+        <w:rPr>
+          <w:rtl/>
+        </w:rPr>
         <w:t xml:space="preserve">4. מדדי הצלחה · Success Metrics / KPIs</w:t>
       </w:r>
       <w:r>
+        <w:rPr>
+          <w:rtl/>
+        </w:rPr>
         <w:t xml:space="preserve"> </w:t>
       </w:r>
       <w:r>
         <w:rPr>
           <w:iCs/>
           <w:i/>
-        </w:rPr>
-        <w:t xml:space="preserve">(optional)</w:t>
-      </w:r>
-    </w:p>
-    <w:p>
-      <w:pPr>
-        <w:pStyle w:val="BlockText"/>
+          <w:rtl/>
+        </w:rPr>
+        <w:t xml:space="preserve">(אופציונלי / optional)</w:t>
+      </w:r>
+    </w:p>
+    <w:p>
+      <w:pPr>
+        <w:pStyle w:val="FirstParagraph"/>
+        <w:bidi/>
+        <w:jc w:val="right"/>
       </w:pPr>
       <w:r>
         <w:rPr>
           <w:iCs/>
           <w:i/>
-        </w:rPr>
-        <w:t xml:space="preserve">Guidance: How performance in this role is measured. Tie to the org’s KPI set</w:t>
+          <w:rtl/>
+        </w:rPr>
+        <w:t xml:space="preserve">מה למלא:</w:t>
+      </w:r>
+      <w:r>
+        <w:rPr>
+          <w:rtl/>
+        </w:rPr>
+        <w:t xml:space="preserve"> </w:t>
+      </w:r>
+      <w:r>
+        <w:rPr>
+          <w:rtl/>
+        </w:rPr>
+        <w:t xml:space="preserve">כיצד נמדדת ההצלחה בתפקיד. כל מדד עם יעד ותדירות. קשרו לתבנית ה-KPI.</w:t>
+      </w:r>
+    </w:p>
+    <w:p>
+      <w:pPr>
+        <w:pStyle w:val="BodyText"/>
+        <w:bidi/>
+        <w:jc w:val="right"/>
+      </w:pPr>
+      <w:r>
+        <w:rPr>
+          <w:rtl/>
+        </w:rPr>
+        <w:t>_______________________________________________________</w:t>
+      </w:r>
+      <w:r>
+        <w:rPr>
+          <w:rtl/>
+        </w:rPr>
+        <w:t xml:space="preserve"> </w:t>
+      </w:r>
+      <w:r>
+        <w:rPr>
+          <w:rtl/>
+        </w:rPr>
+        <w:t>_______________________________________________________</w:t>
+      </w:r>
+      <w:r>
+        <w:rPr>
+          <w:rtl/>
+        </w:rPr>
+        <w:t xml:space="preserve"> </w:t>
+      </w:r>
+      <w:r>
+        <w:rPr>
+          <w:rtl/>
+        </w:rPr>
+      </w:r>
+    </w:p>
+    <w:bookmarkEnd w:id="25"/>
+    <w:bookmarkStart w:id="26" w:name="X2baefc0432ef5e3db217b0c8b3a469a943d7b9b"/>
+    <w:p>
+      <w:pPr>
+        <w:pStyle w:val="Heading2"/>
+        <w:bidi/>
+        <w:jc w:val="right"/>
+      </w:pPr>
+      <w:r>
+        <w:rPr>
+          <w:rtl/>
+        </w:rPr>
+        <w:t xml:space="preserve">5. כישורים ודרישות · Qualifications &amp; Requirements</w:t>
+      </w:r>
+      <w:r>
+        <w:rPr>
+          <w:rtl/>
+        </w:rPr>
+        <w:t xml:space="preserve"> </w:t>
       </w:r>
       <w:r>
         <w:rPr>
           <w:iCs/>
           <w:i/>
-        </w:rPr>
-        <w:t xml:space="preserve"> </w:t>
-      </w:r>
+          <w:rtl/>
+        </w:rPr>
+        <w:t xml:space="preserve">(אופציונלי / optional)</w:t>
+      </w:r>
+    </w:p>
+    <w:p>
+      <w:pPr>
+        <w:pStyle w:val="FirstParagraph"/>
+        <w:bidi/>
+        <w:jc w:val="right"/>
+      </w:pPr>
       <w:r>
         <w:rPr>
           <w:iCs/>
           <w:i/>
-        </w:rPr>
-        <w:t xml:space="preserve">once that template exists. Keep measurable.</w:t>
-      </w:r>
-    </w:p>
-    <w:p>
-      <w:pPr>
-        <w:numPr>
-          <w:ilvl w:val="0"/>
-          <w:numId w:val="1003"/>
-        </w:numPr>
-        <w:pStyle w:val="Compact"/>
-      </w:pPr>
-      <w:r>
-        <w:t xml:space="preserve">[להשלמה / TO FILL: KPI + target/cadence]</w:t>
-      </w:r>
-    </w:p>
-    <w:p>
-      <w:pPr>
-        <w:numPr>
-          <w:ilvl w:val="0"/>
-          <w:numId w:val="1003"/>
-        </w:numPr>
-        <w:pStyle w:val="Compact"/>
-      </w:pPr>
-      <w:r>
-        <w:t xml:space="preserve">[להשלמה / TO FILL]</w:t>
-      </w:r>
-    </w:p>
-    <w:bookmarkEnd w:id="25"/>
-    <w:bookmarkStart w:id="26" w:name="Xbc0bd111e29688f413a4f4399cc5cf1660922ba"/>
+          <w:rtl/>
+        </w:rPr>
+        <w:t xml:space="preserve">מה למלא:</w:t>
+      </w:r>
+      <w:r>
+        <w:rPr>
+          <w:rtl/>
+        </w:rPr>
+        <w:t xml:space="preserve"> </w:t>
+      </w:r>
+      <w:r>
+        <w:rPr>
+          <w:rtl/>
+        </w:rPr>
+        <w:t xml:space="preserve">השכלה, ניסיון מקצועי, מומחיות תחומית וכישורי ליבה. הפרידו בין</w:t>
+      </w:r>
+      <w:r>
+        <w:rPr>
+          <w:rtl/>
+        </w:rPr>
+        <w:t xml:space="preserve"> </w:t>
+      </w:r>
+      <w:r>
+        <w:rPr>
+          <w:rtl/>
+        </w:rPr>
+        <w:t xml:space="preserve">“</w:t>
+      </w:r>
+      <w:r>
+        <w:rPr>
+          <w:rtl/>
+        </w:rPr>
+        <w:t xml:space="preserve">חובה</w:t>
+      </w:r>
+      <w:r>
+        <w:rPr>
+          <w:rtl/>
+        </w:rPr>
+        <w:t xml:space="preserve">”</w:t>
+      </w:r>
+      <w:r>
+        <w:rPr>
+          <w:rtl/>
+        </w:rPr>
+        <w:t xml:space="preserve"> </w:t>
+      </w:r>
+      <w:r>
+        <w:rPr>
+          <w:rtl/>
+        </w:rPr>
+        <w:t xml:space="preserve">לבין</w:t>
+      </w:r>
+      <w:r>
+        <w:rPr>
+          <w:rtl/>
+        </w:rPr>
+        <w:t xml:space="preserve"> </w:t>
+      </w:r>
+      <w:r>
+        <w:rPr>
+          <w:rtl/>
+        </w:rPr>
+        <w:t xml:space="preserve">“</w:t>
+      </w:r>
+      <w:r>
+        <w:rPr>
+          <w:rtl/>
+        </w:rPr>
+        <w:t xml:space="preserve">יתרון</w:t>
+      </w:r>
+      <w:r>
+        <w:rPr>
+          <w:rtl/>
+        </w:rPr>
+        <w:t xml:space="preserve">”</w:t>
+      </w:r>
+      <w:r>
+        <w:rPr>
+          <w:rtl/>
+        </w:rPr>
+        <w:t xml:space="preserve">.</w:t>
+      </w:r>
+    </w:p>
+    <w:p>
+      <w:pPr>
+        <w:pStyle w:val="BodyText"/>
+        <w:bidi/>
+        <w:jc w:val="right"/>
+      </w:pPr>
+      <w:r>
+        <w:rPr>
+          <w:rtl/>
+        </w:rPr>
+        <w:t xml:space="preserve">חובה / Required:</w:t>
+      </w:r>
+      <w:r>
+        <w:rPr>
+          <w:rtl/>
+        </w:rPr>
+        <w:t xml:space="preserve"> </w:t>
+      </w:r>
+      <w:r>
+        <w:rPr>
+          <w:rtl/>
+        </w:rPr>
+        <w:t>_______________________________________________________</w:t>
+      </w:r>
+      <w:r>
+        <w:rPr>
+          <w:rtl/>
+        </w:rPr>
+        <w:t xml:space="preserve"> </w:t>
+      </w:r>
+      <w:r>
+        <w:rPr>
+          <w:rtl/>
+        </w:rPr>
+        <w:t>_______________________________________________________</w:t>
+      </w:r>
+      <w:r>
+        <w:rPr>
+          <w:rtl/>
+        </w:rPr>
+        <w:t xml:space="preserve"> </w:t>
+      </w:r>
+      <w:r>
+        <w:rPr>
+          <w:rtl/>
+        </w:rPr>
+        <w:t xml:space="preserve">יתרון / Advantage:</w:t>
+      </w:r>
+      <w:r>
+        <w:rPr>
+          <w:rtl/>
+        </w:rPr>
+        <w:t xml:space="preserve"> </w:t>
+      </w:r>
+      <w:r>
+        <w:rPr>
+          <w:rtl/>
+        </w:rPr>
+        <w:t>_______________________________________________________</w:t>
+      </w:r>
+      <w:r>
+        <w:rPr>
+          <w:rtl/>
+        </w:rPr>
+        <w:t xml:space="preserve"> </w:t>
+      </w:r>
+      <w:r>
+        <w:rPr>
+          <w:rtl/>
+        </w:rPr>
+      </w:r>
+    </w:p>
+    <w:bookmarkEnd w:id="26"/>
+    <w:bookmarkStart w:id="27" w:name="X6203ab254b8217d8f753e886888711d27cd507a"/>
     <w:p>
       <w:pPr>
         <w:pStyle w:val="Heading2"/>
-      </w:pPr>
-      <w:r>
-        <w:t xml:space="preserve">5. כישורים ודרישות · Qualifications &amp; Requirements</w:t>
-      </w:r>
-      <w:r>
+        <w:bidi/>
+        <w:jc w:val="right"/>
+      </w:pPr>
+      <w:r>
+        <w:rPr>
+          <w:rtl/>
+        </w:rPr>
+        <w:t xml:space="preserve">6. סמכויות וגבולות החלטה · Authority &amp; Decision Boundaries</w:t>
+      </w:r>
+      <w:r>
+        <w:rPr>
+          <w:rtl/>
+        </w:rPr>
         <w:t xml:space="preserve"> </w:t>
       </w:r>
       <w:r>
         <w:rPr>
           <w:iCs/>
           <w:i/>
-        </w:rPr>
-        <w:t xml:space="preserve">(optional)</w:t>
-      </w:r>
-    </w:p>
-    <w:p>
-      <w:pPr>
-        <w:pStyle w:val="BlockText"/>
+          <w:rtl/>
+        </w:rPr>
+        <w:t xml:space="preserve">(אופציונלי / optional)</w:t>
+      </w:r>
+    </w:p>
+    <w:p>
+      <w:pPr>
+        <w:pStyle w:val="FirstParagraph"/>
+        <w:bidi/>
+        <w:jc w:val="right"/>
       </w:pPr>
       <w:r>
         <w:rPr>
           <w:iCs/>
           <w:i/>
-        </w:rPr>
-        <w:t xml:space="preserve">Guidance: Education, professional experience, domain expertise, and core</w:t>
-      </w:r>
-      <w:r>
-        <w:rPr>
-          <w:iCs/>
-          <w:i/>
-        </w:rPr>
-        <w:t xml:space="preserve"> </w:t>
-      </w:r>
-      <w:r>
-        <w:rPr>
-          <w:iCs/>
-          <w:i/>
-        </w:rPr>
-        <w:t xml:space="preserve">competencies required. Separate</w:t>
-      </w:r>
-      <w:r>
-        <w:rPr>
-          <w:iCs/>
-          <w:i/>
-        </w:rPr>
-        <w:t xml:space="preserve"> </w:t>
-      </w:r>
-      <w:r>
-        <w:rPr>
-          <w:iCs/>
-          <w:i/>
-        </w:rPr>
-        <w:t xml:space="preserve">“</w:t>
-      </w:r>
-      <w:r>
-        <w:rPr>
-          <w:iCs/>
-          <w:i/>
-        </w:rPr>
-        <w:t xml:space="preserve">must have</w:t>
-      </w:r>
-      <w:r>
-        <w:rPr>
-          <w:iCs/>
-          <w:i/>
-        </w:rPr>
-        <w:t xml:space="preserve">”</w:t>
-      </w:r>
-      <w:r>
-        <w:rPr>
-          <w:iCs/>
-          <w:i/>
-        </w:rPr>
-        <w:t xml:space="preserve"> </w:t>
-      </w:r>
-      <w:r>
-        <w:rPr>
-          <w:iCs/>
-          <w:i/>
-        </w:rPr>
-        <w:t xml:space="preserve">from</w:t>
-      </w:r>
-      <w:r>
-        <w:rPr>
-          <w:iCs/>
-          <w:i/>
-        </w:rPr>
-        <w:t xml:space="preserve"> </w:t>
-      </w:r>
-      <w:r>
-        <w:rPr>
-          <w:iCs/>
-          <w:i/>
-        </w:rPr>
-        <w:t xml:space="preserve">“</w:t>
-      </w:r>
-      <w:r>
-        <w:rPr>
-          <w:iCs/>
-          <w:i/>
-        </w:rPr>
-        <w:t xml:space="preserve">advantage</w:t>
-      </w:r>
-      <w:r>
-        <w:rPr>
-          <w:iCs/>
-          <w:i/>
-        </w:rPr>
-        <w:t xml:space="preserve">”</w:t>
-      </w:r>
-      <w:r>
-        <w:rPr>
-          <w:iCs/>
-          <w:i/>
-        </w:rPr>
-        <w:t xml:space="preserve">.</w:t>
-      </w:r>
-    </w:p>
-    <w:p>
-      <w:pPr>
-        <w:numPr>
-          <w:ilvl w:val="0"/>
-          <w:numId w:val="1004"/>
-        </w:numPr>
-        <w:pStyle w:val="Compact"/>
-      </w:pPr>
-      <w:r>
-        <w:rPr>
-          <w:bCs/>
-          <w:b/>
-        </w:rPr>
-        <w:t xml:space="preserve">חובה / Required:</w:t>
-      </w:r>
-      <w:r>
-        <w:t xml:space="preserve"> </w:t>
-      </w:r>
-      <w:r>
-        <w:t xml:space="preserve">[להשלמה / TO FILL]</w:t>
-      </w:r>
-    </w:p>
-    <w:p>
-      <w:pPr>
-        <w:numPr>
-          <w:ilvl w:val="0"/>
-          <w:numId w:val="1004"/>
-        </w:numPr>
-        <w:pStyle w:val="Compact"/>
-      </w:pPr>
-      <w:r>
-        <w:rPr>
-          <w:bCs/>
-          <w:b/>
-        </w:rPr>
-        <w:t xml:space="preserve">יתרון / Advantage:</w:t>
-      </w:r>
-      <w:r>
-        <w:t xml:space="preserve"> </w:t>
-      </w:r>
-      <w:r>
-        <w:t xml:space="preserve">[להשלמה / TO FILL]</w:t>
-      </w:r>
-    </w:p>
-    <w:bookmarkEnd w:id="26"/>
-    <w:bookmarkStart w:id="27" w:name="X8e437d4dbde8f4c27e4a43ac449025fc665135c"/>
-    <w:p>
-      <w:pPr>
-        <w:pStyle w:val="Heading2"/>
-      </w:pPr>
-      <w:r>
-        <w:t xml:space="preserve">6. סמכויות וגבולות החלטה · Authority &amp; Decision Boundaries</w:t>
-      </w:r>
-      <w:r>
-        <w:t xml:space="preserve"> </w:t>
-      </w:r>
-      <w:r>
-        <w:rPr>
-          <w:iCs/>
-          <w:i/>
-        </w:rPr>
-        <w:t xml:space="preserve">(optional)</w:t>
-      </w:r>
-    </w:p>
-    <w:p>
-      <w:pPr>
-        <w:pStyle w:val="BlockText"/>
-      </w:pPr>
-      <w:r>
-        <w:rPr>
-          <w:iCs/>
-          <w:i/>
-        </w:rPr>
-        <w:t xml:space="preserve">Guidance: What this role decides alone vs. recommends vs. escalates. Mirrors</w:t>
-      </w:r>
-      <w:r>
-        <w:rPr>
-          <w:iCs/>
-          <w:i/>
-        </w:rPr>
-        <w:t xml:space="preserve"> </w:t>
-      </w:r>
-      <w:r>
-        <w:rPr>
-          <w:iCs/>
-          <w:i/>
-        </w:rPr>
-        <w:t xml:space="preserve">the Always / Ask-first / Escalate logic.</w:t>
-      </w:r>
-    </w:p>
-    <w:p>
-      <w:pPr>
-        <w:numPr>
-          <w:ilvl w:val="0"/>
-          <w:numId w:val="1005"/>
-        </w:numPr>
-        <w:pStyle w:val="Compact"/>
-      </w:pPr>
-      <w:r>
-        <w:rPr>
-          <w:bCs/>
-          <w:b/>
+          <w:rtl/>
+        </w:rPr>
+        <w:t xml:space="preserve">מה למלא:</w:t>
+      </w:r>
+      <w:r>
+        <w:rPr>
+          <w:rtl/>
+        </w:rPr>
+        <w:t xml:space="preserve"> </w:t>
+      </w:r>
+      <w:r>
+        <w:rPr>
+          <w:rtl/>
+        </w:rPr>
+        <w:t xml:space="preserve">מה בעל התפקיד מחליט לבד, על מה הוא ממליץ, ומה הוא מסלים כלפי מעלה.</w:t>
+      </w:r>
+    </w:p>
+    <w:p>
+      <w:pPr>
+        <w:pStyle w:val="BodyText"/>
+        <w:bidi/>
+        <w:jc w:val="right"/>
+      </w:pPr>
+      <w:r>
+        <w:rPr>
+          <w:rtl/>
         </w:rPr>
         <w:t xml:space="preserve">מחליט עצמאית / Decides:</w:t>
       </w:r>
       <w:r>
-        <w:t xml:space="preserve"> </w:t>
-      </w:r>
-      <w:r>
-        <w:t xml:space="preserve">[להשלמה / TO FILL]</w:t>
-      </w:r>
-    </w:p>
-    <w:p>
-      <w:pPr>
-        <w:numPr>
-          <w:ilvl w:val="0"/>
-          <w:numId w:val="1005"/>
-        </w:numPr>
-        <w:pStyle w:val="Compact"/>
-      </w:pPr>
-      <w:r>
-        <w:rPr>
-          <w:bCs/>
-          <w:b/>
+        <w:rPr>
+          <w:rtl/>
+        </w:rPr>
+        <w:t xml:space="preserve"> </w:t>
+      </w:r>
+      <w:r>
+        <w:rPr>
+          <w:rtl/>
+        </w:rPr>
+        <w:t>_______________________________________________________</w:t>
+      </w:r>
+      <w:r>
+        <w:rPr>
+          <w:rtl/>
+        </w:rPr>
+        <w:t xml:space="preserve"> </w:t>
+      </w:r>
+      <w:r>
+        <w:rPr>
+          <w:rtl/>
         </w:rPr>
         <w:t xml:space="preserve">ממליץ / Recommends:</w:t>
       </w:r>
       <w:r>
-        <w:t xml:space="preserve"> </w:t>
-      </w:r>
-      <w:r>
-        <w:t xml:space="preserve">[להשלמה / TO FILL]</w:t>
-      </w:r>
-    </w:p>
-    <w:p>
-      <w:pPr>
-        <w:numPr>
-          <w:ilvl w:val="0"/>
-          <w:numId w:val="1005"/>
-        </w:numPr>
-        <w:pStyle w:val="Compact"/>
-      </w:pPr>
-      <w:r>
-        <w:rPr>
-          <w:bCs/>
-          <w:b/>
+        <w:rPr>
+          <w:rtl/>
+        </w:rPr>
+        <w:t xml:space="preserve"> </w:t>
+      </w:r>
+      <w:r>
+        <w:rPr>
+          <w:rtl/>
+        </w:rPr>
+        <w:t>_______________________________________________________</w:t>
+      </w:r>
+      <w:r>
+        <w:rPr>
+          <w:rtl/>
+        </w:rPr>
+        <w:t xml:space="preserve"> </w:t>
+      </w:r>
+      <w:r>
+        <w:rPr>
+          <w:rtl/>
         </w:rPr>
         <w:t xml:space="preserve">מסלים / Escalates:</w:t>
       </w:r>
       <w:r>
-        <w:t xml:space="preserve"> </w:t>
-      </w:r>
-      <w:r>
-        <w:t xml:space="preserve">[להשלמה / TO FILL]</w:t>
+        <w:rPr>
+          <w:rtl/>
+        </w:rPr>
+        <w:t xml:space="preserve"> </w:t>
+      </w:r>
+      <w:r>
+        <w:rPr>
+          <w:rtl/>
+        </w:rPr>
+        <w:t>_______________________________________________________</w:t>
       </w:r>
     </w:p>
     <w:bookmarkEnd w:id="27"/>
@@ -1071,99 +1598,8 @@
       </w:pPr>
     </w:lvl>
   </w:abstractNum>
-  <w:abstractNum w:abstractNumId="991">
-    <w:nsid w:val="A991"/>
-    <w:multiLevelType w:val="multilevel"/>
-    <w:lvl w:ilvl="0">
-      <w:numFmt w:val="bullet"/>
-      <w:lvlText w:val="•"/>
-      <w:lvlJc w:val="left"/>
-      <w:pPr>
-        <w:ind w:left="720" w:hanging="480"/>
-      </w:pPr>
-    </w:lvl>
-    <w:lvl w:ilvl="1">
-      <w:numFmt w:val="bullet"/>
-      <w:lvlText w:val="–"/>
-      <w:lvlJc w:val="left"/>
-      <w:pPr>
-        <w:ind w:left="1440" w:hanging="480"/>
-      </w:pPr>
-    </w:lvl>
-    <w:lvl w:ilvl="2">
-      <w:numFmt w:val="bullet"/>
-      <w:lvlText w:val="•"/>
-      <w:lvlJc w:val="left"/>
-      <w:pPr>
-        <w:ind w:left="2160" w:hanging="480"/>
-      </w:pPr>
-    </w:lvl>
-    <w:lvl w:ilvl="3">
-      <w:numFmt w:val="bullet"/>
-      <w:lvlText w:val="–"/>
-      <w:lvlJc w:val="left"/>
-      <w:pPr>
-        <w:ind w:left="2880" w:hanging="480"/>
-      </w:pPr>
-    </w:lvl>
-    <w:lvl w:ilvl="4">
-      <w:numFmt w:val="bullet"/>
-      <w:lvlText w:val="•"/>
-      <w:lvlJc w:val="left"/>
-      <w:pPr>
-        <w:ind w:left="3600" w:hanging="480"/>
-      </w:pPr>
-    </w:lvl>
-    <w:lvl w:ilvl="5">
-      <w:numFmt w:val="bullet"/>
-      <w:lvlText w:val="–"/>
-      <w:lvlJc w:val="left"/>
-      <w:pPr>
-        <w:ind w:left="4320" w:hanging="480"/>
-      </w:pPr>
-    </w:lvl>
-    <w:lvl w:ilvl="6">
-      <w:numFmt w:val="bullet"/>
-      <w:lvlText w:val="•"/>
-      <w:lvlJc w:val="left"/>
-      <w:pPr>
-        <w:ind w:left="5040" w:hanging="480"/>
-      </w:pPr>
-    </w:lvl>
-    <w:lvl w:ilvl="7">
-      <w:numFmt w:val="bullet"/>
-      <w:lvlText w:val="–"/>
-      <w:lvlJc w:val="left"/>
-      <w:pPr>
-        <w:ind w:left="5760" w:hanging="480"/>
-      </w:pPr>
-    </w:lvl>
-    <w:lvl w:ilvl="8">
-      <w:numFmt w:val="bullet"/>
-      <w:lvlText w:val="•"/>
-      <w:lvlJc w:val="left"/>
-      <w:pPr>
-        <w:ind w:left="6480" w:hanging="480"/>
-      </w:pPr>
-    </w:lvl>
-  </w:abstractNum>
   <w:num w:numId="1000">
     <w:abstractNumId w:val="990"/>
-  </w:num>
-  <w:num w:numId="1001">
-    <w:abstractNumId w:val="991"/>
-  </w:num>
-  <w:num w:numId="1002">
-    <w:abstractNumId w:val="991"/>
-  </w:num>
-  <w:num w:numId="1003">
-    <w:abstractNumId w:val="991"/>
-  </w:num>
-  <w:num w:numId="1004">
-    <w:abstractNumId w:val="991"/>
-  </w:num>
-  <w:num w:numId="1005">
-    <w:abstractNumId w:val="991"/>
   </w:num>
 </w:numbering>
 </file>

</xml_diff>

<commit_message>
Fix RTL: set section base direction (sectPr bidi) on rendered Word files
Per-paragraph bidi + right alignment alone left the document's section base
direction LTR, which Word renders as left-flowing despite paragraph settings.
Add <w:bidi/> to every section's sectPr (the document-level RTL switch) in
rtl_postprocess.py and regenerate all six dist/word/*.docx.

https://claude.ai/code/session_01AVeYWVQcnguBEpZNQZ1Nyc
</commit_message>
<xml_diff>
--- a/dist/word/job-description.docx
+++ b/dist/word/job-description.docx
@@ -1492,7 +1492,9 @@
     </w:p>
     <w:bookmarkEnd w:id="27"/>
     <w:bookmarkEnd w:id="28"/>
-    <w:sectPr/>
+    <w:sectPr>
+      <w:bidi/>
+    </w:sectPr>
   </w:body>
 </w:document>
 </file>

</xml_diff>

<commit_message>
Fix RTL alignment: drive right-alignment via bidi, not jc=right
Inspecting real Word-authored Hebrew docs showed Word right-aligns RTL text via
<w:bidi/> alone (paragraph + section) with NO <w:jc>; it treats jc="right" in a
bidi paragraph as the logical end (physical LEFT) — the exact left-alignment
symptom reported. Stop setting jc=right, strip inherited jc from paragraphs and
styles, and let the RTL default (start = right) align the text. Regenerate all
six dist/word/*.docx.

https://claude.ai/code/session_01AVeYWVQcnguBEpZNQZ1Nyc
</commit_message>
<xml_diff>
--- a/dist/word/job-description.docx
+++ b/dist/word/job-description.docx
@@ -7,7 +7,6 @@
       <w:pPr>
         <w:pStyle w:val="Heading1"/>
         <w:bidi/>
-        <w:jc w:val="right"/>
       </w:pPr>
       <w:r>
         <w:rPr>
@@ -20,7 +19,6 @@
       <w:pPr>
         <w:pStyle w:val="FirstParagraph"/>
         <w:bidi/>
-        <w:jc w:val="right"/>
       </w:pPr>
       <w:r>
         <w:rPr>
@@ -71,7 +69,6 @@
       <w:pPr>
         <w:pStyle w:val="BodyText"/>
         <w:bidi/>
-        <w:jc w:val="right"/>
       </w:pPr>
       <w:r>
         <w:rPr>
@@ -136,7 +133,6 @@
       <w:pPr>
         <w:pStyle w:val="BodyText"/>
         <w:bidi/>
-        <w:jc w:val="right"/>
       </w:pPr>
       <w:r>
         <w:rPr>
@@ -237,7 +233,6 @@
       <w:pPr>
         <w:pStyle w:val="BodyText"/>
         <w:bidi/>
-        <w:jc w:val="right"/>
       </w:pPr>
       <w:r>
         <w:rPr>
@@ -302,7 +297,6 @@
       <w:pPr>
         <w:pStyle w:val="BodyText"/>
         <w:bidi/>
-        <w:jc w:val="right"/>
       </w:pPr>
       <w:r>
         <w:rPr>
@@ -367,7 +361,6 @@
       <w:pPr>
         <w:pStyle w:val="BodyText"/>
         <w:bidi/>
-        <w:jc w:val="right"/>
       </w:pPr>
       <w:r>
         <w:rPr>
@@ -419,7 +412,6 @@
     <w:p>
       <w:pPr>
         <w:bidi/>
-        <w:jc w:val="right"/>
       </w:pPr>
       <w:r>
         <w:rPr>
@@ -435,7 +427,6 @@
       <w:pPr>
         <w:pStyle w:val="Heading2"/>
         <w:bidi/>
-        <w:jc w:val="right"/>
       </w:pPr>
       <w:r>
         <w:rPr>
@@ -448,7 +439,6 @@
       <w:pPr>
         <w:pStyle w:val="FirstParagraph"/>
         <w:bidi/>
-        <w:jc w:val="right"/>
       </w:pPr>
       <w:r>
         <w:rPr>
@@ -499,7 +489,6 @@
       <w:pPr>
         <w:pStyle w:val="BodyText"/>
         <w:bidi/>
-        <w:jc w:val="right"/>
       </w:pPr>
       <w:r>
         <w:rPr>
@@ -558,7 +547,6 @@
     <w:p>
       <w:pPr>
         <w:bidi/>
-        <w:jc w:val="right"/>
       </w:pPr>
       <w:r>
         <w:rPr>
@@ -575,7 +563,6 @@
       <w:pPr>
         <w:pStyle w:val="Heading2"/>
         <w:bidi/>
-        <w:jc w:val="right"/>
       </w:pPr>
       <w:r>
         <w:rPr>
@@ -588,7 +575,6 @@
       <w:pPr>
         <w:pStyle w:val="FirstParagraph"/>
         <w:bidi/>
-        <w:jc w:val="right"/>
       </w:pPr>
       <w:r>
         <w:rPr>
@@ -640,7 +626,6 @@
       <w:pPr>
         <w:pStyle w:val="Heading4"/>
         <w:bidi/>
-        <w:jc w:val="right"/>
       </w:pPr>
       <w:r>
         <w:rPr>
@@ -653,7 +638,6 @@
       <w:pPr>
         <w:pStyle w:val="FirstParagraph"/>
         <w:bidi/>
-        <w:jc w:val="right"/>
       </w:pPr>
       <w:r>
         <w:rPr>
@@ -666,7 +650,6 @@
       <w:pPr>
         <w:pStyle w:val="BodyText"/>
         <w:bidi/>
-        <w:jc w:val="right"/>
       </w:pPr>
       <w:r>
         <w:rPr>
@@ -728,7 +711,6 @@
       <w:pPr>
         <w:pStyle w:val="Heading4"/>
         <w:bidi/>
-        <w:jc w:val="right"/>
       </w:pPr>
       <w:r>
         <w:rPr>
@@ -741,7 +723,6 @@
       <w:pPr>
         <w:pStyle w:val="FirstParagraph"/>
         <w:bidi/>
-        <w:jc w:val="right"/>
       </w:pPr>
       <w:r>
         <w:rPr>
@@ -754,7 +735,6 @@
       <w:pPr>
         <w:pStyle w:val="BodyText"/>
         <w:bidi/>
-        <w:jc w:val="right"/>
       </w:pPr>
       <w:r>
         <w:rPr>
@@ -814,7 +794,6 @@
       <w:pPr>
         <w:pStyle w:val="BodyText"/>
         <w:bidi/>
-        <w:jc w:val="right"/>
       </w:pPr>
       <w:r>
         <w:rPr>
@@ -828,7 +807,6 @@
     <w:p>
       <w:pPr>
         <w:bidi/>
-        <w:jc w:val="right"/>
       </w:pPr>
       <w:r>
         <w:rPr>
@@ -846,7 +824,6 @@
       <w:pPr>
         <w:pStyle w:val="Heading2"/>
         <w:bidi/>
-        <w:jc w:val="right"/>
       </w:pPr>
       <w:r>
         <w:rPr>
@@ -873,7 +850,6 @@
       <w:pPr>
         <w:pStyle w:val="FirstParagraph"/>
         <w:bidi/>
-        <w:jc w:val="right"/>
       </w:pPr>
       <w:r>
         <w:rPr>
@@ -919,7 +895,6 @@
             <w:pPr>
               <w:pStyle w:val="Compact"/>
               <w:bidi/>
-              <w:jc w:val="right"/>
             </w:pPr>
             <w:r>
               <w:rPr>
@@ -935,7 +910,6 @@
             <w:pPr>
               <w:pStyle w:val="Compact"/>
               <w:bidi/>
-              <w:jc w:val="right"/>
             </w:pPr>
             <w:r>
               <w:rPr>
@@ -951,7 +925,6 @@
             <w:pPr>
               <w:pStyle w:val="Compact"/>
               <w:bidi/>
-              <w:jc w:val="right"/>
             </w:pPr>
             <w:r>
               <w:rPr>
@@ -969,7 +942,6 @@
             <w:pPr>
               <w:pStyle w:val="Compact"/>
               <w:bidi/>
-              <w:jc w:val="right"/>
             </w:pPr>
             <w:r>
               <w:rPr>
@@ -985,7 +957,6 @@
             <w:pPr>
               <w:pStyle w:val="Compact"/>
               <w:bidi/>
-              <w:jc w:val="right"/>
             </w:pPr>
             <w:r>
               <w:rPr>
@@ -1001,7 +972,6 @@
             <w:pPr>
               <w:pStyle w:val="Compact"/>
               <w:bidi/>
-              <w:jc w:val="right"/>
             </w:pPr>
             <w:r>
               <w:rPr>
@@ -1019,7 +989,6 @@
             <w:pPr>
               <w:pStyle w:val="Compact"/>
               <w:bidi/>
-              <w:jc w:val="right"/>
             </w:pPr>
             <w:r>
               <w:rPr>
@@ -1035,7 +1004,6 @@
             <w:pPr>
               <w:pStyle w:val="Compact"/>
               <w:bidi/>
-              <w:jc w:val="right"/>
             </w:pPr>
             <w:r>
               <w:rPr>
@@ -1051,7 +1019,6 @@
             <w:pPr>
               <w:pStyle w:val="Compact"/>
               <w:bidi/>
-              <w:jc w:val="right"/>
             </w:pPr>
             <w:r>
               <w:rPr>
@@ -1067,7 +1034,6 @@
       <w:pPr>
         <w:pStyle w:val="BodyText"/>
         <w:bidi/>
-        <w:jc w:val="right"/>
       </w:pPr>
       <w:r>
         <w:rPr>
@@ -1081,7 +1047,6 @@
       <w:pPr>
         <w:pStyle w:val="Heading2"/>
         <w:bidi/>
-        <w:jc w:val="right"/>
       </w:pPr>
       <w:r>
         <w:rPr>
@@ -1108,7 +1073,6 @@
       <w:pPr>
         <w:pStyle w:val="FirstParagraph"/>
         <w:bidi/>
-        <w:jc w:val="right"/>
       </w:pPr>
       <w:r>
         <w:rPr>
@@ -1135,7 +1099,6 @@
       <w:pPr>
         <w:pStyle w:val="BodyText"/>
         <w:bidi/>
-        <w:jc w:val="right"/>
       </w:pPr>
       <w:r>
         <w:rPr>
@@ -1173,7 +1136,6 @@
       <w:pPr>
         <w:pStyle w:val="Heading2"/>
         <w:bidi/>
-        <w:jc w:val="right"/>
       </w:pPr>
       <w:r>
         <w:rPr>
@@ -1200,7 +1162,6 @@
       <w:pPr>
         <w:pStyle w:val="FirstParagraph"/>
         <w:bidi/>
-        <w:jc w:val="right"/>
       </w:pPr>
       <w:r>
         <w:rPr>
@@ -1293,7 +1254,6 @@
       <w:pPr>
         <w:pStyle w:val="BodyText"/>
         <w:bidi/>
-        <w:jc w:val="right"/>
       </w:pPr>
       <w:r>
         <w:rPr>
@@ -1367,7 +1327,6 @@
       <w:pPr>
         <w:pStyle w:val="Heading2"/>
         <w:bidi/>
-        <w:jc w:val="right"/>
       </w:pPr>
       <w:r>
         <w:rPr>
@@ -1394,7 +1353,6 @@
       <w:pPr>
         <w:pStyle w:val="FirstParagraph"/>
         <w:bidi/>
-        <w:jc w:val="right"/>
       </w:pPr>
       <w:r>
         <w:rPr>
@@ -1421,7 +1379,6 @@
       <w:pPr>
         <w:pStyle w:val="BodyText"/>
         <w:bidi/>
-        <w:jc w:val="right"/>
       </w:pPr>
       <w:r>
         <w:rPr>
@@ -1629,7 +1586,6 @@
     <w:qFormat/>
     <w:pPr>
       <w:bidi/>
-      <w:jc w:val="right"/>
     </w:pPr>
     <w:rPr>
       <w:rtl/>
@@ -1643,7 +1599,6 @@
     <w:pPr>
       <w:spacing w:after="180" w:before="180"/>
       <w:bidi/>
-      <w:jc w:val="right"/>
     </w:pPr>
     <w:qFormat/>
     <w:rPr>
@@ -1658,7 +1613,6 @@
     <w:qFormat/>
     <w:pPr>
       <w:bidi/>
-      <w:jc w:val="right"/>
     </w:pPr>
     <w:rPr>
       <w:rtl/>
@@ -1672,7 +1626,6 @@
     <w:pPr>
       <w:spacing w:after="36" w:before="36"/>
       <w:bidi/>
-      <w:jc w:val="right"/>
     </w:pPr>
     <w:rPr>
       <w:rtl/>
@@ -1688,7 +1641,6 @@
       <w:keepNext/>
       <w:keepLines/>
       <w:spacing w:after="240" w:before="480"/>
-      <w:jc w:val="right"/>
       <w:bidi/>
     </w:pPr>
     <w:rPr>
@@ -1710,7 +1662,6 @@
       <w:keepNext/>
       <w:keepLines/>
       <w:spacing w:after="240" w:before="240"/>
-      <w:jc w:val="right"/>
       <w:bidi/>
     </w:pPr>
     <w:rPr>
@@ -1727,7 +1678,6 @@
     <w:pPr>
       <w:keepNext/>
       <w:keepLines/>
-      <w:jc w:val="right"/>
       <w:bidi/>
     </w:pPr>
     <w:rPr>
@@ -1742,7 +1692,6 @@
     <w:pPr>
       <w:keepNext/>
       <w:keepLines/>
-      <w:jc w:val="right"/>
       <w:bidi/>
     </w:pPr>
     <w:rPr>
@@ -1758,7 +1707,6 @@
     <w:pPr>
       <w:keepNext/>
       <w:keepLines/>
-      <w:jc w:val="right"/>
       <w:spacing w:after="0" w:before="300"/>
       <w:bidi/>
     </w:pPr>
@@ -1782,7 +1730,6 @@
       <w:keepLines/>
       <w:spacing w:after="300" w:before="100"/>
       <w:bidi/>
-      <w:jc w:val="right"/>
     </w:pPr>
     <w:rPr>
       <w:sz w:val="20"/>
@@ -1798,7 +1745,6 @@
     <w:qFormat/>
     <w:pPr>
       <w:bidi/>
-      <w:jc w:val="right"/>
     </w:pPr>
     <w:rPr>
       <w:rtl/>
@@ -1817,7 +1763,6 @@
       <w:spacing w:after="0" w:before="480"/>
       <w:outlineLvl w:val="0"/>
       <w:bidi/>
-      <w:jc w:val="right"/>
     </w:pPr>
     <w:rPr>
       <w:rFonts w:asciiTheme="majorHAnsi" w:cs="David" w:cstheme="majorBidi" w:eastAsiaTheme="majorEastAsia" w:hAnsiTheme="majorHAnsi"/>
@@ -1842,7 +1787,6 @@
       <w:spacing w:after="0" w:before="200"/>
       <w:outlineLvl w:val="1"/>
       <w:bidi/>
-      <w:jc w:val="right"/>
     </w:pPr>
     <w:rPr>
       <w:rFonts w:asciiTheme="majorHAnsi" w:cs="David" w:cstheme="majorBidi" w:eastAsiaTheme="majorEastAsia" w:hAnsiTheme="majorHAnsi"/>
@@ -1867,7 +1811,6 @@
       <w:spacing w:after="0" w:before="200"/>
       <w:outlineLvl w:val="2"/>
       <w:bidi/>
-      <w:jc w:val="right"/>
     </w:pPr>
     <w:rPr>
       <w:rFonts w:asciiTheme="majorHAnsi" w:cs="David" w:cstheme="majorBidi" w:eastAsiaTheme="majorEastAsia" w:hAnsiTheme="majorHAnsi"/>
@@ -1892,7 +1835,6 @@
       <w:spacing w:after="0" w:before="200"/>
       <w:outlineLvl w:val="3"/>
       <w:bidi/>
-      <w:jc w:val="right"/>
     </w:pPr>
     <w:rPr>
       <w:rFonts w:asciiTheme="majorHAnsi" w:cs="David" w:cstheme="majorBidi" w:eastAsiaTheme="majorEastAsia" w:hAnsiTheme="majorHAnsi"/>
@@ -1917,7 +1859,6 @@
       <w:spacing w:after="0" w:before="200"/>
       <w:outlineLvl w:val="4"/>
       <w:bidi/>
-      <w:jc w:val="right"/>
     </w:pPr>
     <w:rPr>
       <w:rFonts w:asciiTheme="majorHAnsi" w:cs="David" w:cstheme="majorBidi" w:eastAsiaTheme="majorEastAsia" w:hAnsiTheme="majorHAnsi"/>
@@ -1941,7 +1882,6 @@
       <w:spacing w:after="0" w:before="200"/>
       <w:outlineLvl w:val="5"/>
       <w:bidi/>
-      <w:jc w:val="right"/>
     </w:pPr>
     <w:rPr>
       <w:rFonts w:asciiTheme="majorHAnsi" w:cs="David" w:cstheme="majorBidi" w:eastAsiaTheme="majorEastAsia" w:hAnsiTheme="majorHAnsi"/>
@@ -1964,7 +1904,6 @@
       <w:spacing w:after="0" w:before="200"/>
       <w:outlineLvl w:val="6"/>
       <w:bidi/>
-      <w:jc w:val="right"/>
     </w:pPr>
     <w:rPr>
       <w:rFonts w:asciiTheme="majorHAnsi" w:cs="David" w:cstheme="majorBidi" w:eastAsiaTheme="majorEastAsia" w:hAnsiTheme="majorHAnsi"/>
@@ -1987,7 +1926,6 @@
       <w:spacing w:after="0" w:before="200"/>
       <w:outlineLvl w:val="7"/>
       <w:bidi/>
-      <w:jc w:val="right"/>
     </w:pPr>
     <w:rPr>
       <w:rFonts w:asciiTheme="majorHAnsi" w:cs="David" w:cstheme="majorBidi" w:eastAsiaTheme="majorEastAsia" w:hAnsiTheme="majorHAnsi"/>
@@ -2010,7 +1948,6 @@
       <w:spacing w:after="0" w:before="200"/>
       <w:outlineLvl w:val="8"/>
       <w:bidi/>
-      <w:jc w:val="right"/>
     </w:pPr>
     <w:rPr>
       <w:rFonts w:asciiTheme="majorHAnsi" w:cs="David" w:cstheme="majorBidi" w:eastAsiaTheme="majorEastAsia" w:hAnsiTheme="majorHAnsi"/>
@@ -2031,7 +1968,6 @@
       <w:spacing w:after="100" w:before="100"/>
       <w:ind w:firstLine="0" w:left="480" w:right="480"/>
       <w:bidi/>
-      <w:jc w:val="right"/>
     </w:pPr>
     <w:rPr>
       <w:rtl/>
@@ -2047,7 +1983,6 @@
     <w:qFormat/>
     <w:pPr>
       <w:bidi/>
-      <w:jc w:val="right"/>
     </w:pPr>
     <w:rPr>
       <w:rtl/>
@@ -2099,7 +2034,6 @@
       <w:keepLines/>
       <w:spacing w:after="0"/>
       <w:bidi/>
-      <w:jc w:val="right"/>
     </w:pPr>
     <w:rPr>
       <w:b/>
@@ -2112,7 +2046,6 @@
     <w:basedOn w:val="Normal"/>
     <w:pPr>
       <w:bidi/>
-      <w:jc w:val="right"/>
     </w:pPr>
     <w:rPr>
       <w:rtl/>
@@ -2126,7 +2059,6 @@
     <w:pPr>
       <w:spacing w:after="120" w:before="0"/>
       <w:bidi/>
-      <w:jc w:val="right"/>
     </w:pPr>
     <w:rPr>
       <w:i/>
@@ -2140,7 +2072,6 @@
     <w:pPr>
       <w:keepNext/>
       <w:bidi/>
-      <w:jc w:val="right"/>
     </w:pPr>
     <w:rPr>
       <w:rtl/>
@@ -2152,7 +2083,6 @@
     <w:basedOn w:val="Caption"/>
     <w:pPr>
       <w:bidi/>
-      <w:jc w:val="right"/>
     </w:pPr>
     <w:rPr>
       <w:rtl/>
@@ -2164,7 +2094,6 @@
     <w:basedOn w:val="Normal"/>
     <w:pPr>
       <w:bidi/>
-      <w:jc w:val="right"/>
     </w:pPr>
     <w:rPr>
       <w:rtl/>
@@ -2177,7 +2106,6 @@
     <w:pPr>
       <w:keepNext/>
       <w:bidi/>
-      <w:jc w:val="right"/>
     </w:pPr>
     <w:rPr>
       <w:rtl/>
@@ -2226,7 +2154,6 @@
       <w:spacing w:before="240" w:line="259" w:lineRule="auto"/>
       <w:outlineLvl w:val="9"/>
       <w:bidi/>
-      <w:jc w:val="right"/>
     </w:pPr>
     <w:rPr>
       <w:rFonts w:asciiTheme="majorHAnsi" w:cs="David" w:cstheme="majorBidi" w:eastAsiaTheme="majorEastAsia" w:hAnsiTheme="majorHAnsi"/>

</xml_diff>

<commit_message>
Apply learned fill-in design rules across all templates
Fold the human's KPI-template edits into the masters and generalize them:
- one field per line (blank line between fields so pandoc stops merging them)
- plain (non-italic) "מה למלא" guidance in every section; bold field labels
- one example block + "duplicate as needed" (drop pre-duplicated blocks)
- KPI section restructured/renamed to "מדדים / KPI'S"
- auto-center table header rows (rtl_postprocess); body rows stay right
- David font + compact sizes (body 9pt / H2 10pt / H1 11pt) in the reference doc
Record these rules in CLAUDE.md so future artifacts follow them. Regenerate docx.

https://claude.ai/code/session_01AVeYWVQcnguBEpZNQZ1Nyc
</commit_message>
<xml_diff>
--- a/dist/word/job-description.docx
+++ b/dist/word/job-description.docx
@@ -2,7 +2,7 @@
 <file path=word/document.xml><?xml version="1.0" encoding="utf-8"?>
 <w:document xmlns:w="http://schemas.openxmlformats.org/wordprocessingml/2006/main" xmlns:m="http://schemas.openxmlformats.org/officeDocument/2006/math" xmlns:r="http://schemas.openxmlformats.org/officeDocument/2006/relationships" xmlns:o="urn:schemas-microsoft-com:office:office" xmlns:v="urn:schemas-microsoft-com:vml" xmlns:w10="urn:schemas-microsoft-com:office:word" xmlns:a="http://schemas.openxmlformats.org/drawingml/2006/main" xmlns:pic="http://schemas.openxmlformats.org/drawingml/2006/picture" xmlns:wp="http://schemas.openxmlformats.org/drawingml/2006/wordprocessingDrawing">
   <w:body>
-    <w:bookmarkStart w:id="28" w:name="הגדרת-תפקיד-job-role-definition"/>
+    <w:bookmarkStart w:id="27" w:name="הגדרת-תפקיד-job-role-definition"/>
     <w:p>
       <w:pPr>
         <w:pStyle w:val="Heading1"/>
@@ -22,47 +22,9 @@
       </w:pPr>
       <w:r>
         <w:rPr>
-          <w:iCs/>
-          <w:i/>
-          <w:rtl/>
-        </w:rPr>
-        <w:t xml:space="preserve">הסבר כללי:</w:t>
-      </w:r>
-      <w:r>
-        <w:rPr>
-          <w:rtl/>
-        </w:rPr>
-        <w:t xml:space="preserve"> </w:t>
-      </w:r>
-      <w:r>
-        <w:rPr>
-          <w:rtl/>
-        </w:rPr>
-        <w:t xml:space="preserve">מסמך זה מגדיר תפקיד בודד בחברה. מלאו את השדות בקו תחתון. החלקים 1–2 הם</w:t>
-      </w:r>
-      <w:r>
-        <w:rPr>
-          <w:rtl/>
-        </w:rPr>
-        <w:t xml:space="preserve"> </w:t>
-      </w:r>
-      <w:r>
-        <w:rPr>
-          <w:rtl/>
-        </w:rPr>
-        <w:t xml:space="preserve">ליבת המסמך (לכל תפקיד), והחלקים 3–6 הם הרחבות אופציונליות — השאירו את מה שרלוונטי</w:t>
-      </w:r>
-      <w:r>
-        <w:rPr>
-          <w:rtl/>
-        </w:rPr>
-        <w:t xml:space="preserve"> </w:t>
-      </w:r>
-      <w:r>
-        <w:rPr>
-          <w:rtl/>
-        </w:rPr>
-        <w:t xml:space="preserve">ומחקו את היתר.</w:t>
+          <w:rtl/>
+        </w:rPr>
+        <w:t xml:space="preserve">מסמך זה מגדיר תפקיד בודד בחברה. מלאו את השדות בקו תחתון. החלקים 1–2 הם ליבת המסמך (לכל תפקיד); החלקים 3–6 הם הרחבות אופציונליות — השאירו את הרלוונטי ומחקו את היתר.</w:t>
       </w:r>
     </w:p>
     <w:p>
@@ -88,40 +50,14 @@
         <w:rPr>
           <w:rtl/>
         </w:rPr>
-        <w:t xml:space="preserve">—</w:t>
-      </w:r>
-      <w:r>
-        <w:rPr>
-          <w:rtl/>
-        </w:rPr>
-        <w:t xml:space="preserve"> </w:t>
-      </w:r>
-      <w:r>
-        <w:rPr>
-          <w:iCs/>
-          <w:i/>
-          <w:rtl/>
-        </w:rPr>
-        <w:t xml:space="preserve">מה למלא:</w:t>
-      </w:r>
-      <w:r>
-        <w:rPr>
-          <w:rtl/>
-        </w:rPr>
-        <w:t xml:space="preserve"> </w:t>
-      </w:r>
-      <w:r>
-        <w:rPr>
-          <w:rtl/>
-        </w:rPr>
-        <w:t xml:space="preserve">התואר הרשמי (לדוגמה: סמנכ”ל כספים).</w:t>
-      </w:r>
-      <w:r>
-        <w:rPr>
-          <w:rtl/>
-        </w:rPr>
-        <w:t xml:space="preserve"> </w:t>
-      </w:r>
+        <w:t xml:space="preserve">— התואר הרשמי (לדוגמה: סמנכ”ל כספים)</w:t>
+      </w:r>
+    </w:p>
+    <w:p>
+      <w:pPr>
+        <w:pStyle w:val="BodyText"/>
+        <w:bidi/>
+      </w:pPr>
       <w:r>
         <w:rPr>
           <w:rtl/>
@@ -140,7 +76,7 @@
           <w:b/>
           <w:rtl/>
         </w:rPr>
-        <w:t xml:space="preserve">מיצוב התפקיד במשפט / Positioning (one line)</w:t>
+        <w:t xml:space="preserve">מיצוב התפקיד במשפט / Positioning</w:t>
       </w:r>
       <w:r>
         <w:rPr>
@@ -162,11 +98,21 @@
       </w:r>
       <w:r>
         <w:rPr>
-          <w:iCs/>
-          <w:i/>
-          <w:rtl/>
-        </w:rPr>
-        <w:t xml:space="preserve">מה למלא:</w:t>
+          <w:rtl/>
+        </w:rPr>
+        <w:t xml:space="preserve">“</w:t>
+      </w:r>
+      <w:r>
+        <w:rPr>
+          <w:rtl/>
+        </w:rPr>
+        <w:t xml:space="preserve">הזרוע</w:t>
+      </w:r>
+      <w:r>
+        <w:rPr>
+          <w:rtl/>
+        </w:rPr>
+        <w:t xml:space="preserve">”</w:t>
       </w:r>
       <w:r>
         <w:rPr>
@@ -178,50 +124,14 @@
         <w:rPr>
           <w:rtl/>
         </w:rPr>
-        <w:t xml:space="preserve">תיאור בשורה אחת של</w:t>
-      </w:r>
-      <w:r>
-        <w:rPr>
-          <w:rtl/>
-        </w:rPr>
-        <w:t xml:space="preserve"> </w:t>
-      </w:r>
-      <w:r>
-        <w:rPr>
-          <w:rtl/>
-        </w:rPr>
-        <w:t xml:space="preserve">“</w:t>
-      </w:r>
-      <w:r>
-        <w:rPr>
-          <w:rtl/>
-        </w:rPr>
-        <w:t xml:space="preserve">הזרוע</w:t>
-      </w:r>
-      <w:r>
-        <w:rPr>
-          <w:rtl/>
-        </w:rPr>
-        <w:t xml:space="preserve">”</w:t>
-      </w:r>
-      <w:r>
-        <w:rPr>
-          <w:rtl/>
-        </w:rPr>
-        <w:t xml:space="preserve"> </w:t>
-      </w:r>
-      <w:r>
-        <w:rPr>
-          <w:rtl/>
-        </w:rPr>
-        <w:t xml:space="preserve">או הפונקציה שהתפקיד מוביל בחברה.</w:t>
-      </w:r>
-      <w:r>
-        <w:rPr>
-          <w:rtl/>
-        </w:rPr>
-        <w:t xml:space="preserve"> </w:t>
-      </w:r>
+        <w:t xml:space="preserve">או הפונקציה שהתפקיד מוביל, בשורה אחת</w:t>
+      </w:r>
+    </w:p>
+    <w:p>
+      <w:pPr>
+        <w:pStyle w:val="BodyText"/>
+        <w:bidi/>
+      </w:pPr>
       <w:r>
         <w:rPr>
           <w:rtl/>
@@ -242,50 +152,12 @@
         </w:rPr>
         <w:t xml:space="preserve">כפיפות / Reports to</w:t>
       </w:r>
-      <w:r>
-        <w:rPr>
-          <w:rtl/>
-        </w:rPr>
-        <w:t xml:space="preserve"> </w:t>
-      </w:r>
-      <w:r>
-        <w:rPr>
-          <w:rtl/>
-        </w:rPr>
-        <w:t xml:space="preserve">—</w:t>
-      </w:r>
-      <w:r>
-        <w:rPr>
-          <w:rtl/>
-        </w:rPr>
-        <w:t xml:space="preserve"> </w:t>
-      </w:r>
-      <w:r>
-        <w:rPr>
-          <w:iCs/>
-          <w:i/>
-          <w:rtl/>
-        </w:rPr>
-        <w:t xml:space="preserve">מה למלא:</w:t>
-      </w:r>
-      <w:r>
-        <w:rPr>
-          <w:rtl/>
-        </w:rPr>
-        <w:t xml:space="preserve"> </w:t>
-      </w:r>
-      <w:r>
-        <w:rPr>
-          <w:rtl/>
-        </w:rPr>
-        <w:t xml:space="preserve">למי התפקיד כפוף ישירות.</w:t>
-      </w:r>
-      <w:r>
-        <w:rPr>
-          <w:rtl/>
-        </w:rPr>
-        <w:t xml:space="preserve"> </w:t>
-      </w:r>
+    </w:p>
+    <w:p>
+      <w:pPr>
+        <w:pStyle w:val="BodyText"/>
+        <w:bidi/>
+      </w:pPr>
       <w:r>
         <w:rPr>
           <w:rtl/>
@@ -306,50 +178,12 @@
         </w:rPr>
         <w:t xml:space="preserve">כפופים ישירים / Direct reports</w:t>
       </w:r>
-      <w:r>
-        <w:rPr>
-          <w:rtl/>
-        </w:rPr>
-        <w:t xml:space="preserve"> </w:t>
-      </w:r>
-      <w:r>
-        <w:rPr>
-          <w:rtl/>
-        </w:rPr>
-        <w:t xml:space="preserve">—</w:t>
-      </w:r>
-      <w:r>
-        <w:rPr>
-          <w:rtl/>
-        </w:rPr>
-        <w:t xml:space="preserve"> </w:t>
-      </w:r>
-      <w:r>
-        <w:rPr>
-          <w:iCs/>
-          <w:i/>
-          <w:rtl/>
-        </w:rPr>
-        <w:t xml:space="preserve">מה למלא:</w:t>
-      </w:r>
-      <w:r>
-        <w:rPr>
-          <w:rtl/>
-        </w:rPr>
-        <w:t xml:space="preserve"> </w:t>
-      </w:r>
-      <w:r>
-        <w:rPr>
-          <w:rtl/>
-        </w:rPr>
-        <w:t xml:space="preserve">אילו תפקידים כפופים לבעל התפקיד.</w:t>
-      </w:r>
-      <w:r>
-        <w:rPr>
-          <w:rtl/>
-        </w:rPr>
-        <w:t xml:space="preserve"> </w:t>
-      </w:r>
+    </w:p>
+    <w:p>
+      <w:pPr>
+        <w:pStyle w:val="BodyText"/>
+        <w:bidi/>
+      </w:pPr>
       <w:r>
         <w:rPr>
           <w:rtl/>
@@ -370,24 +204,24 @@
         </w:rPr>
         <w:t xml:space="preserve">חטיבה / Division</w:t>
       </w:r>
-      <w:r>
-        <w:rPr>
-          <w:rtl/>
-        </w:rPr>
-        <w:t xml:space="preserve"> </w:t>
-      </w:r>
-      <w:r>
-        <w:rPr>
-          <w:rtl/>
-        </w:rPr>
-        <w:t>— _______________________________________________________</w:t>
-      </w:r>
-      <w:r>
-        <w:rPr>
-          <w:rtl/>
-        </w:rPr>
-        <w:t xml:space="preserve"> </w:t>
-      </w:r>
+    </w:p>
+    <w:p>
+      <w:pPr>
+        <w:pStyle w:val="BodyText"/>
+        <w:bidi/>
+      </w:pPr>
+      <w:r>
+        <w:rPr>
+          <w:rtl/>
+        </w:rPr>
+        <w:t>_______________________________________________________</w:t>
+      </w:r>
+    </w:p>
+    <w:p>
+      <w:pPr>
+        <w:pStyle w:val="BodyText"/>
+        <w:bidi/>
+      </w:pPr>
       <w:r>
         <w:rPr>
           <w:bCs/>
@@ -396,17 +230,17 @@
         </w:rPr>
         <w:t xml:space="preserve">תאריך / Date</w:t>
       </w:r>
-      <w:r>
-        <w:rPr>
-          <w:rtl/>
-        </w:rPr>
-        <w:t xml:space="preserve"> </w:t>
-      </w:r>
-      <w:r>
-        <w:rPr>
-          <w:rtl/>
-        </w:rPr>
-        <w:t>— _______________________________________________________</w:t>
+    </w:p>
+    <w:p>
+      <w:pPr>
+        <w:pStyle w:val="BodyText"/>
+        <w:bidi/>
+      </w:pPr>
+      <w:r>
+        <w:rPr>
+          <w:rtl/>
+        </w:rPr>
+        <w:t>_______________________________________________________</w:t>
       </w:r>
     </w:p>
     <w:p>
@@ -442,47 +276,9 @@
       </w:pPr>
       <w:r>
         <w:rPr>
-          <w:iCs/>
-          <w:i/>
-          <w:rtl/>
-        </w:rPr>
-        <w:t xml:space="preserve">מה למלא:</w:t>
-      </w:r>
-      <w:r>
-        <w:rPr>
-          <w:rtl/>
-        </w:rPr>
-        <w:t xml:space="preserve"> </w:t>
-      </w:r>
-      <w:r>
-        <w:rPr>
-          <w:rtl/>
-        </w:rPr>
-        <w:t xml:space="preserve">2–3 פסקאות קצרות המתארות את המנדט של התפקיד — מה הוא מחזיק מקצה לקצה,</w:t>
-      </w:r>
-      <w:r>
-        <w:rPr>
-          <w:rtl/>
-        </w:rPr>
-        <w:t xml:space="preserve"> </w:t>
-      </w:r>
-      <w:r>
-        <w:rPr>
-          <w:rtl/>
-        </w:rPr>
-        <w:t xml:space="preserve">מהו היקף האחריות שלו בחברה, עם מי הוא עובד בשיתוף אסטרטגי, ולפי איזה סטנדרט הוא</w:t>
-      </w:r>
-      <w:r>
-        <w:rPr>
-          <w:rtl/>
-        </w:rPr>
-        <w:t xml:space="preserve"> </w:t>
-      </w:r>
-      <w:r>
-        <w:rPr>
-          <w:rtl/>
-        </w:rPr>
-        <w:t xml:space="preserve">נמדד. כתבו מנדט, לא רשימת משימות (המשימות נכנסות בחלק 2).</w:t>
+          <w:rtl/>
+        </w:rPr>
+        <w:t xml:space="preserve">מה למלא: 2–3 פסקאות קצרות המתארות את המנדט — מה התפקיד מחזיק מקצה לקצה, היקף האחריות, עם מי הוא עובד בשיתוף אסטרטגי, ולפי איזה סטנדרט הוא נמדד. כתבו מנדט, לא רשימת משימות (המשימות נכנסות בחלק 2).</w:t>
       </w:r>
     </w:p>
     <w:p>
@@ -496,48 +292,36 @@
         </w:rPr>
         <w:t>_______________________________________________________</w:t>
       </w:r>
-      <w:r>
-        <w:rPr>
-          <w:rtl/>
-        </w:rPr>
-        <w:t xml:space="preserve"> </w:t>
-      </w:r>
+    </w:p>
+    <w:p>
+      <w:pPr>
+        <w:pStyle w:val="BodyText"/>
+        <w:bidi/>
+      </w:pPr>
       <w:r>
         <w:rPr>
           <w:rtl/>
         </w:rPr>
         <w:t>_______________________________________________________</w:t>
       </w:r>
-      <w:r>
-        <w:rPr>
-          <w:rtl/>
-        </w:rPr>
-        <w:t xml:space="preserve"> </w:t>
-      </w:r>
+    </w:p>
+    <w:p>
+      <w:pPr>
+        <w:pStyle w:val="BodyText"/>
+        <w:bidi/>
+      </w:pPr>
       <w:r>
         <w:rPr>
           <w:rtl/>
         </w:rPr>
         <w:t>_______________________________________________________</w:t>
       </w:r>
-      <w:r>
-        <w:rPr>
-          <w:rtl/>
-        </w:rPr>
-        <w:t xml:space="preserve"> </w:t>
-      </w:r>
-      <w:r>
-        <w:rPr>
-          <w:rtl/>
-        </w:rPr>
-        <w:t>_______________________________________________________</w:t>
-      </w:r>
-      <w:r>
-        <w:rPr>
-          <w:rtl/>
-        </w:rPr>
-        <w:t xml:space="preserve"> </w:t>
-      </w:r>
+    </w:p>
+    <w:p>
+      <w:pPr>
+        <w:pStyle w:val="BodyText"/>
+        <w:bidi/>
+      </w:pPr>
       <w:r>
         <w:rPr>
           <w:rtl/>
@@ -558,7 +342,7 @@
       </w:r>
     </w:p>
     <w:bookmarkEnd w:id="20"/>
-    <w:bookmarkStart w:id="23" w:name="X121f918db49bcedc00c11464f237d8c82fb8d29"/>
+    <w:bookmarkStart w:id="22" w:name="X121f918db49bcedc00c11464f237d8c82fb8d29"/>
     <w:p>
       <w:pPr>
         <w:pStyle w:val="Heading2"/>
@@ -578,60 +362,22 @@
       </w:pPr>
       <w:r>
         <w:rPr>
-          <w:iCs/>
-          <w:i/>
-          <w:rtl/>
-        </w:rPr>
-        <w:t xml:space="preserve">מה למלא:</w:t>
-      </w:r>
-      <w:r>
-        <w:rPr>
-          <w:rtl/>
-        </w:rPr>
-        <w:t xml:space="preserve"> </w:t>
-      </w:r>
-      <w:r>
-        <w:rPr>
-          <w:rtl/>
-        </w:rPr>
-        <w:t xml:space="preserve">זהו לב המסמך. קבצו את האחריות תחת כותרות-תחום ברורות (בדרך כלל 4–8</w:t>
-      </w:r>
-      <w:r>
-        <w:rPr>
-          <w:rtl/>
-        </w:rPr>
-        <w:t xml:space="preserve"> </w:t>
-      </w:r>
-      <w:r>
-        <w:rPr>
-          <w:rtl/>
-        </w:rPr>
-        <w:t xml:space="preserve">תחומים). תחת כל תחום, רשמו מטלות קונקרטיות ושאפשר להחזיק בהן בעלות. שכפלו את הבלוק</w:t>
-      </w:r>
-      <w:r>
-        <w:rPr>
-          <w:rtl/>
-        </w:rPr>
-        <w:t xml:space="preserve"> </w:t>
-      </w:r>
-      <w:r>
-        <w:rPr>
-          <w:rtl/>
-        </w:rPr>
-        <w:t xml:space="preserve">לכל תחום נוסף.</w:t>
-      </w:r>
-    </w:p>
-    <w:bookmarkStart w:id="21" w:name="תחום-אחריות-responsibility-area-שם-name"/>
-    <w:p>
-      <w:pPr>
-        <w:pStyle w:val="Heading4"/>
-        <w:bidi/>
-      </w:pPr>
-      <w:r>
-        <w:rPr>
-          <w:rtl/>
-        </w:rPr>
-        <w:t xml:space="preserve">תחום אחריות / Responsibility area — שם / Name:</w:t>
+          <w:rtl/>
+        </w:rPr>
+        <w:t xml:space="preserve">מה למלא: זהו לב המסמך. קבצו את האחריות תחת כותרות-תחום ברורות (בדרך כלל 4–8 תחומים). תחת כל תחום — מטלות קונקרטיות שאפשר להחזיק בהן בעלות. שכפלו את הבלוק לכל תחום נוסף.</w:t>
+      </w:r>
+    </w:p>
+    <w:bookmarkStart w:id="21" w:name="תחום-אחריות-responsibility-area"/>
+    <w:p>
+      <w:pPr>
+        <w:pStyle w:val="Heading3"/>
+        <w:bidi/>
+      </w:pPr>
+      <w:r>
+        <w:rPr>
+          <w:rtl/>
+        </w:rPr>
+        <w:t xml:space="preserve">תחום אחריות / Responsibility area:</w:t>
       </w:r>
     </w:p>
     <w:p>
@@ -641,6 +387,20 @@
       </w:pPr>
       <w:r>
         <w:rPr>
+          <w:bCs/>
+          <w:b/>
+          <w:rtl/>
+        </w:rPr>
+        <w:t xml:space="preserve">שם התחום / Area name</w:t>
+      </w:r>
+    </w:p>
+    <w:p>
+      <w:pPr>
+        <w:pStyle w:val="BodyText"/>
+        <w:bidi/>
+      </w:pPr>
+      <w:r>
+        <w:rPr>
           <w:rtl/>
         </w:rPr>
         <w:t>_______________________________________________________</w:t>
@@ -653,137 +413,54 @@
       </w:pPr>
       <w:r>
         <w:rPr>
-          <w:rtl/>
-        </w:rPr>
-        <w:t xml:space="preserve">מטלות / Duties:</w:t>
-      </w:r>
-      <w:r>
-        <w:rPr>
-          <w:rtl/>
-        </w:rPr>
-        <w:t xml:space="preserve"> </w:t>
-      </w:r>
+          <w:bCs/>
+          <w:b/>
+          <w:rtl/>
+        </w:rPr>
+        <w:t xml:space="preserve">מטלות / Duties</w:t>
+      </w:r>
+    </w:p>
+    <w:p>
+      <w:pPr>
+        <w:pStyle w:val="BodyText"/>
+        <w:bidi/>
+      </w:pPr>
       <w:r>
         <w:rPr>
           <w:rtl/>
         </w:rPr>
         <w:t>_______________________________________________________</w:t>
       </w:r>
-      <w:r>
-        <w:rPr>
-          <w:rtl/>
-        </w:rPr>
-        <w:t xml:space="preserve"> </w:t>
-      </w:r>
+    </w:p>
+    <w:p>
+      <w:pPr>
+        <w:pStyle w:val="BodyText"/>
+        <w:bidi/>
+      </w:pPr>
       <w:r>
         <w:rPr>
           <w:rtl/>
         </w:rPr>
         <w:t>_______________________________________________________</w:t>
       </w:r>
-      <w:r>
-        <w:rPr>
-          <w:rtl/>
-        </w:rPr>
-        <w:t xml:space="preserve"> </w:t>
-      </w:r>
+    </w:p>
+    <w:p>
+      <w:pPr>
+        <w:pStyle w:val="BodyText"/>
+        <w:bidi/>
+      </w:pPr>
       <w:r>
         <w:rPr>
           <w:rtl/>
         </w:rPr>
         <w:t>_______________________________________________________</w:t>
       </w:r>
-      <w:r>
-        <w:rPr>
-          <w:rtl/>
-        </w:rPr>
-        <w:t xml:space="preserve"> </w:t>
-      </w:r>
-      <w:r>
-        <w:rPr>
-          <w:rtl/>
-        </w:rPr>
-      </w:r>
-    </w:p>
-    <w:bookmarkEnd w:id="21"/>
-    <w:bookmarkStart w:id="22" w:name="Xe7793f2ab3416fd96a65f1ba407e38e12ed9ead"/>
-    <w:p>
-      <w:pPr>
-        <w:pStyle w:val="Heading4"/>
-        <w:bidi/>
-      </w:pPr>
-      <w:r>
-        <w:rPr>
-          <w:rtl/>
-        </w:rPr>
-        <w:t xml:space="preserve">תחום אחריות / Responsibility area — שם / Name:</w:t>
-      </w:r>
-    </w:p>
-    <w:p>
-      <w:pPr>
-        <w:pStyle w:val="FirstParagraph"/>
-        <w:bidi/>
-      </w:pPr>
-      <w:r>
-        <w:rPr>
-          <w:rtl/>
-        </w:rPr>
-        <w:t>_______________________________________________________</w:t>
-      </w:r>
-    </w:p>
-    <w:p>
-      <w:pPr>
-        <w:pStyle w:val="BodyText"/>
-        <w:bidi/>
-      </w:pPr>
-      <w:r>
-        <w:rPr>
-          <w:rtl/>
-        </w:rPr>
-        <w:t xml:space="preserve">מטלות / Duties:</w:t>
-      </w:r>
-      <w:r>
-        <w:rPr>
-          <w:rtl/>
-        </w:rPr>
-        <w:t xml:space="preserve"> </w:t>
-      </w:r>
-      <w:r>
-        <w:rPr>
-          <w:rtl/>
-        </w:rPr>
-        <w:t>_______________________________________________________</w:t>
-      </w:r>
-      <w:r>
-        <w:rPr>
-          <w:rtl/>
-        </w:rPr>
-        <w:t xml:space="preserve"> </w:t>
-      </w:r>
-      <w:r>
-        <w:rPr>
-          <w:rtl/>
-        </w:rPr>
-        <w:t>_______________________________________________________</w:t>
-      </w:r>
-      <w:r>
-        <w:rPr>
-          <w:rtl/>
-        </w:rPr>
-        <w:t xml:space="preserve"> </w:t>
-      </w:r>
-      <w:r>
-        <w:rPr>
-          <w:rtl/>
-        </w:rPr>
-        <w:t>_______________________________________________________</w:t>
-      </w:r>
-      <w:r>
-        <w:rPr>
-          <w:rtl/>
-        </w:rPr>
-        <w:t xml:space="preserve"> </w:t>
-      </w:r>
+    </w:p>
+    <w:p>
+      <w:pPr>
+        <w:pStyle w:val="BodyText"/>
+        <w:bidi/>
+      </w:pPr>
       <w:r>
         <w:rPr>
           <w:rtl/>
@@ -817,9 +494,9 @@
         </w:pict>
       </w:r>
     </w:p>
+    <w:bookmarkEnd w:id="21"/>
     <w:bookmarkEnd w:id="22"/>
-    <w:bookmarkEnd w:id="23"/>
-    <w:bookmarkStart w:id="24" w:name="X3764d40f020fd9965432ebd92f5fe054eed12e2"/>
+    <w:bookmarkStart w:id="23" w:name="X3764d40f020fd9965432ebd92f5fe054eed12e2"/>
     <w:p>
       <w:pPr>
         <w:pStyle w:val="Heading2"/>
@@ -853,23 +530,9 @@
       </w:pPr>
       <w:r>
         <w:rPr>
-          <w:iCs/>
-          <w:i/>
-          <w:rtl/>
-        </w:rPr>
-        <w:t xml:space="preserve">מה למלא:</w:t>
-      </w:r>
-      <w:r>
-        <w:rPr>
-          <w:rtl/>
-        </w:rPr>
-        <w:t xml:space="preserve"> </w:t>
-      </w:r>
-      <w:r>
-        <w:rPr>
-          <w:rtl/>
-        </w:rPr>
-        <w:t xml:space="preserve">גורמים פנימיים וחיצוניים שאיתם התפקיד עובד באופן קבוע, ומטרת כל ממשק.</w:t>
+          <w:rtl/>
+        </w:rPr>
+        <w:t xml:space="preserve">מה למלא: גורמים פנימיים וחיצוניים שאיתם התפקיד עובד באופן קבוע, ומטרת כל ממשק.</w:t>
       </w:r>
     </w:p>
     <w:tbl>
@@ -895,6 +558,7 @@
             <w:pPr>
               <w:pStyle w:val="Compact"/>
               <w:bidi/>
+              <w:jc w:val="center"/>
             </w:pPr>
             <w:r>
               <w:rPr>
@@ -910,6 +574,7 @@
             <w:pPr>
               <w:pStyle w:val="Compact"/>
               <w:bidi/>
+              <w:jc w:val="center"/>
             </w:pPr>
             <w:r>
               <w:rPr>
@@ -925,6 +590,7 @@
             <w:pPr>
               <w:pStyle w:val="Compact"/>
               <w:bidi/>
+              <w:jc w:val="center"/>
             </w:pPr>
             <w:r>
               <w:rPr>
@@ -1032,17 +698,19 @@
     </w:tbl>
     <w:p>
       <w:pPr>
-        <w:pStyle w:val="BodyText"/>
-        <w:bidi/>
-      </w:pPr>
-      <w:r>
-        <w:rPr>
-          <w:rtl/>
-        </w:rPr>
-      </w:r>
-    </w:p>
-    <w:bookmarkEnd w:id="24"/>
-    <w:bookmarkStart w:id="25" w:name="X264f2a85f389ed5fcb578865706e7a33efb0267"/>
+        <w:bidi/>
+      </w:pPr>
+      <w:r>
+        <w:rPr>
+          <w:rtl/>
+        </w:rPr>
+        <w:pict>
+          <v:rect style="width:0;height:1.5pt" o:hralign="center" o:hrstd="t" o:hr="t"/>
+        </w:pict>
+      </w:r>
+    </w:p>
+    <w:bookmarkEnd w:id="23"/>
+    <w:bookmarkStart w:id="24" w:name="X264f2a85f389ed5fcb578865706e7a33efb0267"/>
     <w:p>
       <w:pPr>
         <w:pStyle w:val="Heading2"/>
@@ -1076,11 +744,86 @@
       </w:pPr>
       <w:r>
         <w:rPr>
+          <w:rtl/>
+        </w:rPr>
+        <w:t xml:space="preserve">מה למלא: כיצד נמדדת ההצלחה בתפקיד. כל מדד עם יעד ותדירות. קשרו לתבנית ה-KPI.</w:t>
+      </w:r>
+    </w:p>
+    <w:p>
+      <w:pPr>
+        <w:pStyle w:val="BodyText"/>
+        <w:bidi/>
+      </w:pPr>
+      <w:r>
+        <w:rPr>
+          <w:rtl/>
+        </w:rPr>
+        <w:t>_______________________________________________________</w:t>
+      </w:r>
+    </w:p>
+    <w:p>
+      <w:pPr>
+        <w:pStyle w:val="BodyText"/>
+        <w:bidi/>
+      </w:pPr>
+      <w:r>
+        <w:rPr>
+          <w:rtl/>
+        </w:rPr>
+        <w:t>_______________________________________________________</w:t>
+      </w:r>
+    </w:p>
+    <w:p>
+      <w:pPr>
+        <w:bidi/>
+      </w:pPr>
+      <w:r>
+        <w:rPr>
+          <w:rtl/>
+        </w:rPr>
+        <w:pict>
+          <v:rect style="width:0;height:1.5pt" o:hralign="center" o:hrstd="t" o:hr="t"/>
+        </w:pict>
+      </w:r>
+    </w:p>
+    <w:bookmarkEnd w:id="24"/>
+    <w:bookmarkStart w:id="25" w:name="X2baefc0432ef5e3db217b0c8b3a469a943d7b9b"/>
+    <w:p>
+      <w:pPr>
+        <w:pStyle w:val="Heading2"/>
+        <w:bidi/>
+      </w:pPr>
+      <w:r>
+        <w:rPr>
+          <w:rtl/>
+        </w:rPr>
+        <w:t xml:space="preserve">5. כישורים ודרישות · Qualifications &amp; Requirements</w:t>
+      </w:r>
+      <w:r>
+        <w:rPr>
+          <w:rtl/>
+        </w:rPr>
+        <w:t xml:space="preserve"> </w:t>
+      </w:r>
+      <w:r>
+        <w:rPr>
           <w:iCs/>
           <w:i/>
           <w:rtl/>
         </w:rPr>
-        <w:t xml:space="preserve">מה למלא:</w:t>
+        <w:t xml:space="preserve">(אופציונלי / optional)</w:t>
+      </w:r>
+    </w:p>
+    <w:p>
+      <w:pPr>
+        <w:pStyle w:val="FirstParagraph"/>
+        <w:bidi/>
+      </w:pPr>
+      <w:r>
+        <w:rPr>
+          <w:rtl/>
+        </w:rPr>
+        <w:t xml:space="preserve">מה למלא: השכלה, ניסיון מקצועי, מומחיות תחומית וכישורי ליבה. הפרידו בין</w:t>
       </w:r>
       <w:r>
         <w:rPr>
@@ -1092,7 +835,45 @@
         <w:rPr>
           <w:rtl/>
         </w:rPr>
-        <w:t xml:space="preserve">כיצד נמדדת ההצלחה בתפקיד. כל מדד עם יעד ותדירות. קשרו לתבנית ה-KPI.</w:t>
+        <w:t xml:space="preserve">“</w:t>
+      </w:r>
+      <w:r>
+        <w:rPr>
+          <w:rtl/>
+        </w:rPr>
+        <w:t xml:space="preserve">חובה</w:t>
+      </w:r>
+      <w:r>
+        <w:rPr>
+          <w:rtl/>
+        </w:rPr>
+        <w:t xml:space="preserve">”</w:t>
+      </w:r>
+      <w:r>
+        <w:rPr>
+          <w:rtl/>
+        </w:rPr>
+        <w:t xml:space="preserve"> </w:t>
+      </w:r>
+      <w:r>
+        <w:rPr>
+          <w:rtl/>
+        </w:rPr>
+        <w:t xml:space="preserve">ל”יתרון”.</w:t>
+      </w:r>
+    </w:p>
+    <w:p>
+      <w:pPr>
+        <w:pStyle w:val="BodyText"/>
+        <w:bidi/>
+      </w:pPr>
+      <w:r>
+        <w:rPr>
+          <w:bCs/>
+          <w:b/>
+          <w:rtl/>
+        </w:rPr>
+        <w:t xml:space="preserve">חובה / Required</w:t>
       </w:r>
     </w:p>
     <w:p>
@@ -1106,32 +887,60 @@
         </w:rPr>
         <w:t>_______________________________________________________</w:t>
       </w:r>
-      <w:r>
-        <w:rPr>
-          <w:rtl/>
-        </w:rPr>
-        <w:t xml:space="preserve"> </w:t>
-      </w:r>
+    </w:p>
+    <w:p>
+      <w:pPr>
+        <w:pStyle w:val="BodyText"/>
+        <w:bidi/>
+      </w:pPr>
       <w:r>
         <w:rPr>
           <w:rtl/>
         </w:rPr>
         <w:t>_______________________________________________________</w:t>
       </w:r>
-      <w:r>
-        <w:rPr>
-          <w:rtl/>
-        </w:rPr>
-        <w:t xml:space="preserve"> </w:t>
-      </w:r>
-      <w:r>
-        <w:rPr>
-          <w:rtl/>
-        </w:rPr>
+    </w:p>
+    <w:p>
+      <w:pPr>
+        <w:pStyle w:val="BodyText"/>
+        <w:bidi/>
+      </w:pPr>
+      <w:r>
+        <w:rPr>
+          <w:bCs/>
+          <w:b/>
+          <w:rtl/>
+        </w:rPr>
+        <w:t xml:space="preserve">יתרון / Advantage</w:t>
+      </w:r>
+    </w:p>
+    <w:p>
+      <w:pPr>
+        <w:pStyle w:val="BodyText"/>
+        <w:bidi/>
+      </w:pPr>
+      <w:r>
+        <w:rPr>
+          <w:rtl/>
+        </w:rPr>
+        <w:t>_______________________________________________________</w:t>
+      </w:r>
+    </w:p>
+    <w:p>
+      <w:pPr>
+        <w:bidi/>
+      </w:pPr>
+      <w:r>
+        <w:rPr>
+          <w:rtl/>
+        </w:rPr>
+        <w:pict>
+          <v:rect style="width:0;height:1.5pt" o:hralign="center" o:hrstd="t" o:hr="t"/>
+        </w:pict>
       </w:r>
     </w:p>
     <w:bookmarkEnd w:id="25"/>
-    <w:bookmarkStart w:id="26" w:name="X2baefc0432ef5e3db217b0c8b3a469a943d7b9b"/>
+    <w:bookmarkStart w:id="26" w:name="X6203ab254b8217d8f753e886888711d27cd507a"/>
     <w:p>
       <w:pPr>
         <w:pStyle w:val="Heading2"/>
@@ -1141,7 +950,7 @@
         <w:rPr>
           <w:rtl/>
         </w:rPr>
-        <w:t xml:space="preserve">5. כישורים ודרישות · Qualifications &amp; Requirements</w:t>
+        <w:t xml:space="preserve">6. סמכויות וגבולות החלטה · Authority &amp; Decision Boundaries</w:t>
       </w:r>
       <w:r>
         <w:rPr>
@@ -1165,290 +974,91 @@
       </w:pPr>
       <w:r>
         <w:rPr>
-          <w:iCs/>
-          <w:i/>
-          <w:rtl/>
-        </w:rPr>
-        <w:t xml:space="preserve">מה למלא:</w:t>
-      </w:r>
-      <w:r>
-        <w:rPr>
-          <w:rtl/>
-        </w:rPr>
-        <w:t xml:space="preserve"> </w:t>
-      </w:r>
-      <w:r>
-        <w:rPr>
-          <w:rtl/>
-        </w:rPr>
-        <w:t xml:space="preserve">השכלה, ניסיון מקצועי, מומחיות תחומית וכישורי ליבה. הפרידו בין</w:t>
-      </w:r>
-      <w:r>
-        <w:rPr>
-          <w:rtl/>
-        </w:rPr>
-        <w:t xml:space="preserve"> </w:t>
-      </w:r>
-      <w:r>
-        <w:rPr>
-          <w:rtl/>
-        </w:rPr>
-        <w:t xml:space="preserve">“</w:t>
-      </w:r>
-      <w:r>
-        <w:rPr>
-          <w:rtl/>
-        </w:rPr>
-        <w:t xml:space="preserve">חובה</w:t>
-      </w:r>
-      <w:r>
-        <w:rPr>
-          <w:rtl/>
-        </w:rPr>
-        <w:t xml:space="preserve">”</w:t>
-      </w:r>
-      <w:r>
-        <w:rPr>
-          <w:rtl/>
-        </w:rPr>
-        <w:t xml:space="preserve"> </w:t>
-      </w:r>
-      <w:r>
-        <w:rPr>
-          <w:rtl/>
-        </w:rPr>
-        <w:t xml:space="preserve">לבין</w:t>
-      </w:r>
-      <w:r>
-        <w:rPr>
-          <w:rtl/>
-        </w:rPr>
-        <w:t xml:space="preserve"> </w:t>
-      </w:r>
-      <w:r>
-        <w:rPr>
-          <w:rtl/>
-        </w:rPr>
-        <w:t xml:space="preserve">“</w:t>
-      </w:r>
-      <w:r>
-        <w:rPr>
-          <w:rtl/>
-        </w:rPr>
-        <w:t xml:space="preserve">יתרון</w:t>
-      </w:r>
-      <w:r>
-        <w:rPr>
-          <w:rtl/>
-        </w:rPr>
-        <w:t xml:space="preserve">”</w:t>
-      </w:r>
-      <w:r>
-        <w:rPr>
-          <w:rtl/>
-        </w:rPr>
-        <w:t xml:space="preserve">.</w:t>
-      </w:r>
-    </w:p>
-    <w:p>
-      <w:pPr>
-        <w:pStyle w:val="BodyText"/>
-        <w:bidi/>
-      </w:pPr>
-      <w:r>
-        <w:rPr>
-          <w:rtl/>
-        </w:rPr>
-        <w:t xml:space="preserve">חובה / Required:</w:t>
-      </w:r>
-      <w:r>
-        <w:rPr>
-          <w:rtl/>
-        </w:rPr>
-        <w:t xml:space="preserve"> </w:t>
-      </w:r>
+          <w:rtl/>
+        </w:rPr>
+        <w:t xml:space="preserve">מה למלא: מה בעל התפקיד מחליט לבד, על מה הוא ממליץ, ומה הוא מסלים כלפי מעלה.</w:t>
+      </w:r>
+    </w:p>
+    <w:p>
+      <w:pPr>
+        <w:pStyle w:val="BodyText"/>
+        <w:bidi/>
+      </w:pPr>
+      <w:r>
+        <w:rPr>
+          <w:bCs/>
+          <w:b/>
+          <w:rtl/>
+        </w:rPr>
+        <w:t xml:space="preserve">מחליט עצמאית / Decides</w:t>
+      </w:r>
+    </w:p>
+    <w:p>
+      <w:pPr>
+        <w:pStyle w:val="BodyText"/>
+        <w:bidi/>
+      </w:pPr>
       <w:r>
         <w:rPr>
           <w:rtl/>
         </w:rPr>
         <w:t>_______________________________________________________</w:t>
       </w:r>
-      <w:r>
-        <w:rPr>
-          <w:rtl/>
-        </w:rPr>
-        <w:t xml:space="preserve"> </w:t>
-      </w:r>
+    </w:p>
+    <w:p>
+      <w:pPr>
+        <w:pStyle w:val="BodyText"/>
+        <w:bidi/>
+      </w:pPr>
+      <w:r>
+        <w:rPr>
+          <w:bCs/>
+          <w:b/>
+          <w:rtl/>
+        </w:rPr>
+        <w:t xml:space="preserve">ממליץ / Recommends</w:t>
+      </w:r>
+    </w:p>
+    <w:p>
+      <w:pPr>
+        <w:pStyle w:val="BodyText"/>
+        <w:bidi/>
+      </w:pPr>
       <w:r>
         <w:rPr>
           <w:rtl/>
         </w:rPr>
         <w:t>_______________________________________________________</w:t>
       </w:r>
-      <w:r>
-        <w:rPr>
-          <w:rtl/>
-        </w:rPr>
-        <w:t xml:space="preserve"> </w:t>
-      </w:r>
-      <w:r>
-        <w:rPr>
-          <w:rtl/>
-        </w:rPr>
-        <w:t xml:space="preserve">יתרון / Advantage:</w:t>
-      </w:r>
-      <w:r>
-        <w:rPr>
-          <w:rtl/>
-        </w:rPr>
-        <w:t xml:space="preserve"> </w:t>
-      </w:r>
+    </w:p>
+    <w:p>
+      <w:pPr>
+        <w:pStyle w:val="BodyText"/>
+        <w:bidi/>
+      </w:pPr>
+      <w:r>
+        <w:rPr>
+          <w:bCs/>
+          <w:b/>
+          <w:rtl/>
+        </w:rPr>
+        <w:t xml:space="preserve">מסלים / Escalates</w:t>
+      </w:r>
+    </w:p>
+    <w:p>
+      <w:pPr>
+        <w:pStyle w:val="BodyText"/>
+        <w:bidi/>
+      </w:pPr>
       <w:r>
         <w:rPr>
           <w:rtl/>
         </w:rPr>
         <w:t>_______________________________________________________</w:t>
       </w:r>
-      <w:r>
-        <w:rPr>
-          <w:rtl/>
-        </w:rPr>
-        <w:t xml:space="preserve"> </w:t>
-      </w:r>
-      <w:r>
-        <w:rPr>
-          <w:rtl/>
-        </w:rPr>
-      </w:r>
     </w:p>
     <w:bookmarkEnd w:id="26"/>
-    <w:bookmarkStart w:id="27" w:name="X6203ab254b8217d8f753e886888711d27cd507a"/>
-    <w:p>
-      <w:pPr>
-        <w:pStyle w:val="Heading2"/>
-        <w:bidi/>
-      </w:pPr>
-      <w:r>
-        <w:rPr>
-          <w:rtl/>
-        </w:rPr>
-        <w:t xml:space="preserve">6. סמכויות וגבולות החלטה · Authority &amp; Decision Boundaries</w:t>
-      </w:r>
-      <w:r>
-        <w:rPr>
-          <w:rtl/>
-        </w:rPr>
-        <w:t xml:space="preserve"> </w:t>
-      </w:r>
-      <w:r>
-        <w:rPr>
-          <w:iCs/>
-          <w:i/>
-          <w:rtl/>
-        </w:rPr>
-        <w:t xml:space="preserve">(אופציונלי / optional)</w:t>
-      </w:r>
-    </w:p>
-    <w:p>
-      <w:pPr>
-        <w:pStyle w:val="FirstParagraph"/>
-        <w:bidi/>
-      </w:pPr>
-      <w:r>
-        <w:rPr>
-          <w:iCs/>
-          <w:i/>
-          <w:rtl/>
-        </w:rPr>
-        <w:t xml:space="preserve">מה למלא:</w:t>
-      </w:r>
-      <w:r>
-        <w:rPr>
-          <w:rtl/>
-        </w:rPr>
-        <w:t xml:space="preserve"> </w:t>
-      </w:r>
-      <w:r>
-        <w:rPr>
-          <w:rtl/>
-        </w:rPr>
-        <w:t xml:space="preserve">מה בעל התפקיד מחליט לבד, על מה הוא ממליץ, ומה הוא מסלים כלפי מעלה.</w:t>
-      </w:r>
-    </w:p>
-    <w:p>
-      <w:pPr>
-        <w:pStyle w:val="BodyText"/>
-        <w:bidi/>
-      </w:pPr>
-      <w:r>
-        <w:rPr>
-          <w:rtl/>
-        </w:rPr>
-        <w:t xml:space="preserve">מחליט עצמאית / Decides:</w:t>
-      </w:r>
-      <w:r>
-        <w:rPr>
-          <w:rtl/>
-        </w:rPr>
-        <w:t xml:space="preserve"> </w:t>
-      </w:r>
-      <w:r>
-        <w:rPr>
-          <w:rtl/>
-        </w:rPr>
-        <w:t>_______________________________________________________</w:t>
-      </w:r>
-      <w:r>
-        <w:rPr>
-          <w:rtl/>
-        </w:rPr>
-        <w:t xml:space="preserve"> </w:t>
-      </w:r>
-      <w:r>
-        <w:rPr>
-          <w:rtl/>
-        </w:rPr>
-        <w:t xml:space="preserve">ממליץ / Recommends:</w:t>
-      </w:r>
-      <w:r>
-        <w:rPr>
-          <w:rtl/>
-        </w:rPr>
-        <w:t xml:space="preserve"> </w:t>
-      </w:r>
-      <w:r>
-        <w:rPr>
-          <w:rtl/>
-        </w:rPr>
-        <w:t>_______________________________________________________</w:t>
-      </w:r>
-      <w:r>
-        <w:rPr>
-          <w:rtl/>
-        </w:rPr>
-        <w:t xml:space="preserve"> </w:t>
-      </w:r>
-      <w:r>
-        <w:rPr>
-          <w:rtl/>
-        </w:rPr>
-        <w:t xml:space="preserve">מסלים / Escalates:</w:t>
-      </w:r>
-      <w:r>
-        <w:rPr>
-          <w:rtl/>
-        </w:rPr>
-        <w:t xml:space="preserve"> </w:t>
-      </w:r>
-      <w:r>
-        <w:rPr>
-          <w:rtl/>
-        </w:rPr>
-        <w:t>_______________________________________________________</w:t>
-      </w:r>
-    </w:p>
     <w:bookmarkEnd w:id="27"/>
-    <w:bookmarkEnd w:id="28"/>
     <w:sectPr>
       <w:bidi/>
     </w:sectPr>
@@ -1589,7 +1199,9 @@
     </w:pPr>
     <w:rPr>
       <w:rtl/>
-      <w:rFonts w:cs="David"/>
+      <w:rFonts w:ascii="David" w:cs="David" w:hAnsi="David"/>
+      <w:sz w:val="18"/>
+      <w:szCs w:val="18"/>
     </w:rPr>
   </w:style>
   <w:style w:styleId="BodyText" w:type="paragraph">
@@ -1603,7 +1215,9 @@
     <w:qFormat/>
     <w:rPr>
       <w:rtl/>
-      <w:rFonts w:cs="David"/>
+      <w:rFonts w:ascii="David" w:cs="David" w:hAnsi="David"/>
+      <w:sz w:val="18"/>
+      <w:szCs w:val="18"/>
     </w:rPr>
   </w:style>
   <w:style w:customStyle="1" w:styleId="FirstParagraph" w:type="paragraph">
@@ -1616,7 +1230,9 @@
     </w:pPr>
     <w:rPr>
       <w:rtl/>
-      <w:rFonts w:cs="David"/>
+      <w:rFonts w:ascii="David" w:cs="David" w:hAnsi="David"/>
+      <w:sz w:val="18"/>
+      <w:szCs w:val="18"/>
     </w:rPr>
   </w:style>
   <w:style w:customStyle="1" w:styleId="Compact" w:type="paragraph">
@@ -1629,7 +1245,9 @@
     </w:pPr>
     <w:rPr>
       <w:rtl/>
-      <w:rFonts w:cs="David"/>
+      <w:rFonts w:ascii="David" w:cs="David" w:hAnsi="David"/>
+      <w:sz w:val="18"/>
+      <w:szCs w:val="18"/>
     </w:rPr>
   </w:style>
   <w:style w:styleId="Title" w:type="paragraph">
@@ -1644,12 +1262,12 @@
       <w:bidi/>
     </w:pPr>
     <w:rPr>
-      <w:rFonts w:asciiTheme="majorHAnsi" w:cs="David" w:cstheme="majorBidi" w:eastAsiaTheme="majorEastAsia" w:hAnsiTheme="majorHAnsi"/>
+      <w:rFonts w:ascii="David" w:asciiTheme="majorHAnsi" w:cs="David" w:cstheme="majorBidi" w:eastAsiaTheme="majorEastAsia" w:hAnsi="David" w:hAnsiTheme="majorHAnsi"/>
       <w:b/>
       <w:bCs/>
       <w:color w:themeColor="accent1" w:themeShade="B5" w:val="345A8A"/>
-      <w:sz w:val="36"/>
-      <w:szCs w:val="36"/>
+      <w:sz w:val="22"/>
+      <w:szCs w:val="22"/>
       <w:rtl/>
     </w:rPr>
   </w:style>
@@ -1665,10 +1283,10 @@
       <w:bidi/>
     </w:pPr>
     <w:rPr>
-      <w:sz w:val="30"/>
-      <w:szCs w:val="30"/>
-      <w:rtl/>
-      <w:rFonts w:cs="David"/>
+      <w:sz w:val="22"/>
+      <w:szCs w:val="22"/>
+      <w:rtl/>
+      <w:rFonts w:ascii="David" w:cs="David" w:hAnsi="David"/>
     </w:rPr>
   </w:style>
   <w:style w:customStyle="1" w:styleId="Author" w:type="paragraph">
@@ -1682,7 +1300,9 @@
     </w:pPr>
     <w:rPr>
       <w:rtl/>
-      <w:rFonts w:cs="David"/>
+      <w:rFonts w:ascii="David" w:cs="David" w:hAnsi="David"/>
+      <w:sz w:val="18"/>
+      <w:szCs w:val="18"/>
     </w:rPr>
   </w:style>
   <w:style w:styleId="Date" w:type="paragraph">
@@ -1696,7 +1316,9 @@
     </w:pPr>
     <w:rPr>
       <w:rtl/>
-      <w:rFonts w:cs="David"/>
+      <w:rFonts w:ascii="David" w:cs="David" w:hAnsi="David"/>
+      <w:sz w:val="18"/>
+      <w:szCs w:val="18"/>
     </w:rPr>
   </w:style>
   <w:style w:customStyle="1" w:styleId="AbstractTitle" w:type="paragraph">
@@ -1711,13 +1333,13 @@
       <w:bidi/>
     </w:pPr>
     <w:rPr>
-      <w:sz w:val="20"/>
-      <w:szCs w:val="20"/>
+      <w:sz w:val="22"/>
+      <w:szCs w:val="22"/>
       <w:b/>
       <w:color w:val="345A8A"/>
       &gt;
       <w:rtl/>
-      <w:rFonts w:cs="David"/>
+      <w:rFonts w:ascii="David" w:cs="David" w:hAnsi="David"/>
     </w:rPr>
   </w:style>
   <w:style w:customStyle="1" w:styleId="Abstract" w:type="paragraph">
@@ -1732,10 +1354,10 @@
       <w:bidi/>
     </w:pPr>
     <w:rPr>
-      <w:sz w:val="20"/>
-      <w:szCs w:val="20"/>
-      <w:rtl/>
-      <w:rFonts w:cs="David"/>
+      <w:sz w:val="18"/>
+      <w:szCs w:val="18"/>
+      <w:rtl/>
+      <w:rFonts w:ascii="David" w:cs="David" w:hAnsi="David"/>
     </w:rPr>
   </w:style>
   <w:style w:styleId="Bibliography" w:type="paragraph">
@@ -1748,7 +1370,9 @@
     </w:pPr>
     <w:rPr>
       <w:rtl/>
-      <w:rFonts w:cs="David"/>
+      <w:rFonts w:ascii="David" w:cs="David" w:hAnsi="David"/>
+      <w:sz w:val="18"/>
+      <w:szCs w:val="18"/>
     </w:rPr>
   </w:style>
   <w:style w:styleId="Heading1" w:type="paragraph">
@@ -1765,12 +1389,12 @@
       <w:bidi/>
     </w:pPr>
     <w:rPr>
-      <w:rFonts w:asciiTheme="majorHAnsi" w:cs="David" w:cstheme="majorBidi" w:eastAsiaTheme="majorEastAsia" w:hAnsiTheme="majorHAnsi"/>
+      <w:rFonts w:ascii="David" w:asciiTheme="majorHAnsi" w:cs="David" w:cstheme="majorBidi" w:eastAsiaTheme="majorEastAsia" w:hAnsi="David" w:hAnsiTheme="majorHAnsi"/>
       <w:b/>
       <w:bCs/>
       <w:color w:themeColor="accent1" w:val="4F81BD"/>
-      <w:sz w:val="32"/>
-      <w:szCs w:val="32"/>
+      <w:sz w:val="22"/>
+      <w:szCs w:val="22"/>
       <w:rtl/>
     </w:rPr>
   </w:style>
@@ -1789,12 +1413,12 @@
       <w:bidi/>
     </w:pPr>
     <w:rPr>
-      <w:rFonts w:asciiTheme="majorHAnsi" w:cs="David" w:cstheme="majorBidi" w:eastAsiaTheme="majorEastAsia" w:hAnsiTheme="majorHAnsi"/>
+      <w:rFonts w:ascii="David" w:asciiTheme="majorHAnsi" w:cs="David" w:cstheme="majorBidi" w:eastAsiaTheme="majorEastAsia" w:hAnsi="David" w:hAnsiTheme="majorHAnsi"/>
       <w:b/>
       <w:bCs/>
       <w:color w:themeColor="accent1" w:val="4F81BD"/>
-      <w:sz w:val="28"/>
-      <w:szCs w:val="28"/>
+      <w:sz w:val="20"/>
+      <w:szCs w:val="20"/>
       <w:rtl/>
     </w:rPr>
   </w:style>
@@ -1813,12 +1437,12 @@
       <w:bidi/>
     </w:pPr>
     <w:rPr>
-      <w:rFonts w:asciiTheme="majorHAnsi" w:cs="David" w:cstheme="majorBidi" w:eastAsiaTheme="majorEastAsia" w:hAnsiTheme="majorHAnsi"/>
+      <w:rFonts w:ascii="David" w:asciiTheme="majorHAnsi" w:cs="David" w:cstheme="majorBidi" w:eastAsiaTheme="majorEastAsia" w:hAnsi="David" w:hAnsiTheme="majorHAnsi"/>
       <w:b/>
       <w:bCs/>
       <w:color w:themeColor="accent1" w:val="4F81BD"/>
-      <w:sz w:val="24"/>
-      <w:szCs w:val="24"/>
+      <w:sz w:val="18"/>
+      <w:szCs w:val="18"/>
       <w:rtl/>
     </w:rPr>
   </w:style>
@@ -1837,12 +1461,12 @@
       <w:bidi/>
     </w:pPr>
     <w:rPr>
-      <w:rFonts w:asciiTheme="majorHAnsi" w:cs="David" w:cstheme="majorBidi" w:eastAsiaTheme="majorEastAsia" w:hAnsiTheme="majorHAnsi"/>
+      <w:rFonts w:ascii="David" w:asciiTheme="majorHAnsi" w:cs="David" w:cstheme="majorBidi" w:eastAsiaTheme="majorEastAsia" w:hAnsi="David" w:hAnsiTheme="majorHAnsi"/>
       <w:i/>
       <w:bCs/>
       <w:color w:themeColor="accent1" w:val="4F81BD"/>
-      <w:sz w:val="24"/>
-      <w:szCs w:val="24"/>
+      <w:sz w:val="18"/>
+      <w:szCs w:val="18"/>
       <w:rtl/>
     </w:rPr>
   </w:style>
@@ -1861,11 +1485,11 @@
       <w:bidi/>
     </w:pPr>
     <w:rPr>
-      <w:rFonts w:asciiTheme="majorHAnsi" w:cs="David" w:cstheme="majorBidi" w:eastAsiaTheme="majorEastAsia" w:hAnsiTheme="majorHAnsi"/>
+      <w:rFonts w:ascii="David" w:asciiTheme="majorHAnsi" w:cs="David" w:cstheme="majorBidi" w:eastAsiaTheme="majorEastAsia" w:hAnsi="David" w:hAnsiTheme="majorHAnsi"/>
       <w:iCs/>
       <w:color w:themeColor="accent1" w:val="4F81BD"/>
-      <w:sz w:val="24"/>
-      <w:szCs w:val="24"/>
+      <w:sz w:val="18"/>
+      <w:szCs w:val="18"/>
       <w:rtl/>
     </w:rPr>
   </w:style>
@@ -1884,10 +1508,10 @@
       <w:bidi/>
     </w:pPr>
     <w:rPr>
-      <w:rFonts w:asciiTheme="majorHAnsi" w:cs="David" w:cstheme="majorBidi" w:eastAsiaTheme="majorEastAsia" w:hAnsiTheme="majorHAnsi"/>
+      <w:rFonts w:ascii="David" w:asciiTheme="majorHAnsi" w:cs="David" w:cstheme="majorBidi" w:eastAsiaTheme="majorEastAsia" w:hAnsi="David" w:hAnsiTheme="majorHAnsi"/>
       <w:color w:themeColor="accent1" w:val="4F81BD"/>
-      <w:sz w:val="24"/>
-      <w:szCs w:val="24"/>
+      <w:sz w:val="18"/>
+      <w:szCs w:val="18"/>
       <w:rtl/>
     </w:rPr>
   </w:style>
@@ -1906,10 +1530,10 @@
       <w:bidi/>
     </w:pPr>
     <w:rPr>
-      <w:rFonts w:asciiTheme="majorHAnsi" w:cs="David" w:cstheme="majorBidi" w:eastAsiaTheme="majorEastAsia" w:hAnsiTheme="majorHAnsi"/>
+      <w:rFonts w:ascii="David" w:asciiTheme="majorHAnsi" w:cs="David" w:cstheme="majorBidi" w:eastAsiaTheme="majorEastAsia" w:hAnsi="David" w:hAnsiTheme="majorHAnsi"/>
       <w:color w:themeColor="accent1" w:val="4F81BD"/>
-      <w:sz w:val="24"/>
-      <w:szCs w:val="24"/>
+      <w:sz w:val="18"/>
+      <w:szCs w:val="18"/>
       <w:rtl/>
     </w:rPr>
   </w:style>
@@ -1928,10 +1552,10 @@
       <w:bidi/>
     </w:pPr>
     <w:rPr>
-      <w:rFonts w:asciiTheme="majorHAnsi" w:cs="David" w:cstheme="majorBidi" w:eastAsiaTheme="majorEastAsia" w:hAnsiTheme="majorHAnsi"/>
+      <w:rFonts w:ascii="David" w:asciiTheme="majorHAnsi" w:cs="David" w:cstheme="majorBidi" w:eastAsiaTheme="majorEastAsia" w:hAnsi="David" w:hAnsiTheme="majorHAnsi"/>
       <w:color w:themeColor="accent1" w:val="4F81BD"/>
-      <w:sz w:val="24"/>
-      <w:szCs w:val="24"/>
+      <w:sz w:val="18"/>
+      <w:szCs w:val="18"/>
       <w:rtl/>
     </w:rPr>
   </w:style>
@@ -1950,10 +1574,10 @@
       <w:bidi/>
     </w:pPr>
     <w:rPr>
-      <w:rFonts w:asciiTheme="majorHAnsi" w:cs="David" w:cstheme="majorBidi" w:eastAsiaTheme="majorEastAsia" w:hAnsiTheme="majorHAnsi"/>
+      <w:rFonts w:ascii="David" w:asciiTheme="majorHAnsi" w:cs="David" w:cstheme="majorBidi" w:eastAsiaTheme="majorEastAsia" w:hAnsi="David" w:hAnsiTheme="majorHAnsi"/>
       <w:color w:themeColor="accent1" w:val="4F81BD"/>
-      <w:sz w:val="24"/>
-      <w:szCs w:val="24"/>
+      <w:sz w:val="18"/>
+      <w:szCs w:val="18"/>
       <w:rtl/>
     </w:rPr>
   </w:style>
@@ -1971,7 +1595,9 @@
     </w:pPr>
     <w:rPr>
       <w:rtl/>
-      <w:rFonts w:cs="David"/>
+      <w:rFonts w:ascii="David" w:cs="David" w:hAnsi="David"/>
+      <w:sz w:val="18"/>
+      <w:szCs w:val="18"/>
     </w:rPr>
   </w:style>
   <w:style w:styleId="FootnoteText" w:type="paragraph">
@@ -1986,7 +1612,9 @@
     </w:pPr>
     <w:rPr>
       <w:rtl/>
-      <w:rFonts w:cs="David"/>
+      <w:rFonts w:ascii="David" w:cs="David" w:hAnsi="David"/>
+      <w:sz w:val="18"/>
+      <w:szCs w:val="18"/>
     </w:rPr>
   </w:style>
   <w:style w:default="1" w:styleId="DefaultParagraphFont" w:type="character">
@@ -2038,7 +1666,9 @@
     <w:rPr>
       <w:b/>
       <w:rtl/>
-      <w:rFonts w:cs="David"/>
+      <w:rFonts w:ascii="David" w:cs="David" w:hAnsi="David"/>
+      <w:sz w:val="18"/>
+      <w:szCs w:val="18"/>
     </w:rPr>
   </w:style>
   <w:style w:customStyle="1" w:styleId="Definition" w:type="paragraph">
@@ -2049,7 +1679,9 @@
     </w:pPr>
     <w:rPr>
       <w:rtl/>
-      <w:rFonts w:cs="David"/>
+      <w:rFonts w:ascii="David" w:cs="David" w:hAnsi="David"/>
+      <w:sz w:val="18"/>
+      <w:szCs w:val="18"/>
     </w:rPr>
   </w:style>
   <w:style w:styleId="Caption" w:type="paragraph">
@@ -2063,7 +1695,9 @@
     <w:rPr>
       <w:i/>
       <w:rtl/>
-      <w:rFonts w:cs="David"/>
+      <w:rFonts w:ascii="David" w:cs="David" w:hAnsi="David"/>
+      <w:sz w:val="18"/>
+      <w:szCs w:val="18"/>
     </w:rPr>
   </w:style>
   <w:style w:customStyle="1" w:styleId="TableCaption" w:type="paragraph">
@@ -2075,7 +1709,9 @@
     </w:pPr>
     <w:rPr>
       <w:rtl/>
-      <w:rFonts w:cs="David"/>
+      <w:rFonts w:ascii="David" w:cs="David" w:hAnsi="David"/>
+      <w:sz w:val="18"/>
+      <w:szCs w:val="18"/>
     </w:rPr>
   </w:style>
   <w:style w:customStyle="1" w:styleId="ImageCaption" w:type="paragraph">
@@ -2086,7 +1722,9 @@
     </w:pPr>
     <w:rPr>
       <w:rtl/>
-      <w:rFonts w:cs="David"/>
+      <w:rFonts w:ascii="David" w:cs="David" w:hAnsi="David"/>
+      <w:sz w:val="18"/>
+      <w:szCs w:val="18"/>
     </w:rPr>
   </w:style>
   <w:style w:customStyle="1" w:styleId="Figure" w:type="paragraph">
@@ -2097,7 +1735,9 @@
     </w:pPr>
     <w:rPr>
       <w:rtl/>
-      <w:rFonts w:cs="David"/>
+      <w:rFonts w:ascii="David" w:cs="David" w:hAnsi="David"/>
+      <w:sz w:val="18"/>
+      <w:szCs w:val="18"/>
     </w:rPr>
   </w:style>
   <w:style w:customStyle="1" w:styleId="CaptionedFigure" w:type="paragraph">
@@ -2109,7 +1749,9 @@
     </w:pPr>
     <w:rPr>
       <w:rtl/>
-      <w:rFonts w:cs="David"/>
+      <w:rFonts w:ascii="David" w:cs="David" w:hAnsi="David"/>
+      <w:sz w:val="18"/>
+      <w:szCs w:val="18"/>
     </w:rPr>
   </w:style>
   <w:style w:customStyle="1" w:styleId="BodyTextChar" w:type="character">
@@ -2156,11 +1798,13 @@
       <w:bidi/>
     </w:pPr>
     <w:rPr>
-      <w:rFonts w:asciiTheme="majorHAnsi" w:cs="David" w:cstheme="majorBidi" w:eastAsiaTheme="majorEastAsia" w:hAnsiTheme="majorHAnsi"/>
+      <w:rFonts w:ascii="David" w:asciiTheme="majorHAnsi" w:cs="David" w:cstheme="majorBidi" w:eastAsiaTheme="majorEastAsia" w:hAnsi="David" w:hAnsiTheme="majorHAnsi"/>
       <w:b w:val="0"/>
       <w:bCs w:val="0"/>
       <w:color w:themeColor="accent1" w:themeShade="BF" w:val="365F91"/>
       <w:rtl/>
+      <w:sz w:val="18"/>
+      <w:szCs w:val="18"/>
     </w:rPr>
   </w:style>
   <w:style w:type="paragraph" w:customStyle="1" w:styleId="SourceCode">

</xml_diff>